<commit_message>
Update RAG policy documents
</commit_message>
<xml_diff>
--- a/data/policy_v2.docx
+++ b/data/policy_v2.docx
@@ -9,7 +9,6 @@
         <w:rPr>
           <w:rFonts w:ascii="Times New Roman" w:hAnsi="Times New Roman" w:cs="Times New Roman"/>
           <w:b/>
-          <w:color w:val="1A3A5C"/>
           <w:sz w:val="32"/>
           <w:szCs w:val="32"/>
         </w:rPr>
@@ -18,7 +17,6 @@
         <w:rPr>
           <w:rFonts w:ascii="Times New Roman" w:hAnsi="Times New Roman" w:cs="Times New Roman"/>
           <w:b/>
-          <w:color w:val="1A3A5C"/>
           <w:sz w:val="32"/>
           <w:szCs w:val="32"/>
         </w:rPr>
@@ -37,7 +35,6 @@
         <w:rPr>
           <w:rFonts w:ascii="Times New Roman" w:hAnsi="Times New Roman" w:cs="Times New Roman"/>
           <w:b/>
-          <w:color w:val="1A3A5C"/>
         </w:rPr>
         <w:t>SECTION 1: ELIGIBILITY</w:t>
       </w:r>
@@ -53,21 +50,18 @@
       <w:r>
         <w:rPr>
           <w:rFonts w:ascii="Times New Roman" w:hAnsi="Times New Roman" w:cs="Times New Roman"/>
-          <w:color w:val="444441"/>
         </w:rPr>
         <w:t xml:space="preserve">This section defines all fields and rules used to determine whether a sales representative qualifies for Incentive Compensation (IC) payout </w:t>
       </w:r>
       <w:r>
         <w:rPr>
           <w:rFonts w:ascii="Times New Roman" w:hAnsi="Times New Roman" w:cs="Times New Roman"/>
-          <w:color w:val="444441"/>
         </w:rPr>
         <w:t>in each</w:t>
       </w:r>
       <w:r>
         <w:rPr>
           <w:rFonts w:ascii="Times New Roman" w:hAnsi="Times New Roman" w:cs="Times New Roman"/>
-          <w:color w:val="444441"/>
         </w:rPr>
         <w:t xml:space="preserve"> quarter.</w:t>
       </w:r>
@@ -93,7 +87,6 @@
         <w:rPr>
           <w:rFonts w:ascii="Times New Roman" w:hAnsi="Times New Roman" w:cs="Times New Roman"/>
           <w:b/>
-          <w:color w:val="185FA5"/>
         </w:rPr>
         <w:t>1.1 Geographic and Territory Structure</w:t>
       </w:r>
@@ -109,7 +102,6 @@
       <w:r>
         <w:rPr>
           <w:rFonts w:ascii="Times New Roman" w:hAnsi="Times New Roman" w:cs="Times New Roman"/>
-          <w:color w:val="444441"/>
         </w:rPr>
         <w:t>The IC system organizes sales coverage into a four-level hierarchy: Area &gt; Region &gt; Territory &gt; Rep. Each level has an ID and a name field.</w:t>
       </w:r>
@@ -127,28 +119,24 @@
         <w:rPr>
           <w:rFonts w:ascii="Times New Roman" w:hAnsi="Times New Roman" w:cs="Times New Roman"/>
           <w:b/>
-          <w:color w:val="1A3A5C"/>
         </w:rPr>
         <w:t xml:space="preserve">Area ID — </w:t>
       </w:r>
       <w:r>
         <w:rPr>
           <w:rFonts w:ascii="Times New Roman" w:hAnsi="Times New Roman" w:cs="Times New Roman"/>
-          <w:color w:val="444441"/>
         </w:rPr>
         <w:t xml:space="preserve">Unique identifier for the sales area, which groups multiple </w:t>
       </w:r>
       <w:r>
         <w:rPr>
           <w:rFonts w:ascii="Times New Roman" w:hAnsi="Times New Roman" w:cs="Times New Roman"/>
-          <w:color w:val="444441"/>
         </w:rPr>
         <w:t>areas</w:t>
       </w:r>
       <w:r>
         <w:rPr>
           <w:rFonts w:ascii="Times New Roman" w:hAnsi="Times New Roman" w:cs="Times New Roman"/>
-          <w:color w:val="444441"/>
         </w:rPr>
         <w:t>.</w:t>
       </w:r>
@@ -166,14 +154,12 @@
         <w:rPr>
           <w:rFonts w:ascii="Times New Roman" w:hAnsi="Times New Roman" w:cs="Times New Roman"/>
           <w:b/>
-          <w:color w:val="1A3A5C"/>
         </w:rPr>
         <w:t xml:space="preserve">Area Name — </w:t>
       </w:r>
       <w:r>
         <w:rPr>
           <w:rFonts w:ascii="Times New Roman" w:hAnsi="Times New Roman" w:cs="Times New Roman"/>
-          <w:color w:val="444441"/>
         </w:rPr>
         <w:t>Descriptive name of the area.</w:t>
       </w:r>
@@ -191,14 +177,12 @@
         <w:rPr>
           <w:rFonts w:ascii="Times New Roman" w:hAnsi="Times New Roman" w:cs="Times New Roman"/>
           <w:b/>
-          <w:color w:val="1A3A5C"/>
         </w:rPr>
         <w:t xml:space="preserve">Region ID — </w:t>
       </w:r>
       <w:r>
         <w:rPr>
           <w:rFonts w:ascii="Times New Roman" w:hAnsi="Times New Roman" w:cs="Times New Roman"/>
-          <w:color w:val="444441"/>
         </w:rPr>
         <w:t>Unique identifier for a specific region within an area.</w:t>
       </w:r>
@@ -216,14 +200,12 @@
         <w:rPr>
           <w:rFonts w:ascii="Times New Roman" w:hAnsi="Times New Roman" w:cs="Times New Roman"/>
           <w:b/>
-          <w:color w:val="1A3A5C"/>
         </w:rPr>
         <w:t xml:space="preserve">Region Name — </w:t>
       </w:r>
       <w:r>
         <w:rPr>
           <w:rFonts w:ascii="Times New Roman" w:hAnsi="Times New Roman" w:cs="Times New Roman"/>
-          <w:color w:val="444441"/>
         </w:rPr>
         <w:t>Descriptive name of the region, linking it to its territories.</w:t>
       </w:r>
@@ -241,28 +223,24 @@
         <w:rPr>
           <w:rFonts w:ascii="Times New Roman" w:hAnsi="Times New Roman" w:cs="Times New Roman"/>
           <w:b/>
-          <w:color w:val="1A3A5C"/>
         </w:rPr>
         <w:t xml:space="preserve">Territory ID — </w:t>
       </w:r>
       <w:r>
         <w:rPr>
           <w:rFonts w:ascii="Times New Roman" w:hAnsi="Times New Roman" w:cs="Times New Roman"/>
-          <w:color w:val="444441"/>
         </w:rPr>
         <w:t xml:space="preserve">Unique identifier assigned to a sales </w:t>
       </w:r>
       <w:r>
         <w:rPr>
           <w:rFonts w:ascii="Times New Roman" w:hAnsi="Times New Roman" w:cs="Times New Roman"/>
-          <w:color w:val="444441"/>
         </w:rPr>
         <w:t>territory</w:t>
       </w:r>
       <w:r>
         <w:rPr>
           <w:rFonts w:ascii="Times New Roman" w:hAnsi="Times New Roman" w:cs="Times New Roman"/>
-          <w:color w:val="444441"/>
         </w:rPr>
         <w:t>.</w:t>
       </w:r>
@@ -280,14 +258,12 @@
         <w:rPr>
           <w:rFonts w:ascii="Times New Roman" w:hAnsi="Times New Roman" w:cs="Times New Roman"/>
           <w:b/>
-          <w:color w:val="1A3A5C"/>
         </w:rPr>
         <w:t xml:space="preserve">Territory Name — </w:t>
       </w:r>
       <w:r>
         <w:rPr>
           <w:rFonts w:ascii="Times New Roman" w:hAnsi="Times New Roman" w:cs="Times New Roman"/>
-          <w:color w:val="444441"/>
         </w:rPr>
         <w:t>Descriptive name of the territory assigned to the representative.</w:t>
       </w:r>
@@ -305,14 +281,12 @@
         <w:rPr>
           <w:rFonts w:ascii="Times New Roman" w:hAnsi="Times New Roman" w:cs="Times New Roman"/>
           <w:b/>
-          <w:color w:val="1A3A5C"/>
         </w:rPr>
         <w:t xml:space="preserve">Parent Geo ID — </w:t>
       </w:r>
       <w:r>
         <w:rPr>
           <w:rFonts w:ascii="Times New Roman" w:hAnsi="Times New Roman" w:cs="Times New Roman"/>
-          <w:color w:val="444441"/>
         </w:rPr>
         <w:t>Identifier of the higher-level geographic region to which the territory.</w:t>
       </w:r>
@@ -324,56 +298,48 @@
         <w:jc w:val="both"/>
         <w:rPr>
           <w:rFonts w:ascii="Times New Roman" w:hAnsi="Times New Roman" w:cs="Times New Roman"/>
-          <w:color w:val="444441"/>
-        </w:rPr>
-      </w:pPr>
-      <w:r>
-        <w:rPr>
-          <w:rFonts w:ascii="Times New Roman" w:hAnsi="Times New Roman" w:cs="Times New Roman"/>
-          <w:b/>
-          <w:color w:val="1A3A5C"/>
+        </w:rPr>
+      </w:pPr>
+      <w:r>
+        <w:rPr>
+          <w:rFonts w:ascii="Times New Roman" w:hAnsi="Times New Roman" w:cs="Times New Roman"/>
+          <w:b/>
         </w:rPr>
         <w:t xml:space="preserve">Parent Geo Name — </w:t>
       </w:r>
       <w:r>
         <w:rPr>
           <w:rFonts w:ascii="Times New Roman" w:hAnsi="Times New Roman" w:cs="Times New Roman"/>
-          <w:color w:val="444441"/>
         </w:rPr>
         <w:t>Name of the parent geographic region that</w:t>
       </w:r>
       <w:r>
         <w:rPr>
           <w:rFonts w:ascii="Times New Roman" w:hAnsi="Times New Roman" w:cs="Times New Roman"/>
-          <w:color w:val="444441"/>
         </w:rPr>
         <w:t xml:space="preserve"> </w:t>
       </w:r>
       <w:r>
         <w:rPr>
           <w:rFonts w:ascii="Times New Roman" w:hAnsi="Times New Roman" w:cs="Times New Roman"/>
-          <w:color w:val="444441"/>
         </w:rPr>
         <w:t>multiple territorie</w:t>
       </w:r>
       <w:r>
         <w:rPr>
           <w:rFonts w:ascii="Times New Roman" w:hAnsi="Times New Roman" w:cs="Times New Roman"/>
-          <w:color w:val="444441"/>
         </w:rPr>
         <w:t xml:space="preserve">s </w:t>
       </w:r>
       <w:r>
         <w:rPr>
           <w:rFonts w:ascii="Times New Roman" w:hAnsi="Times New Roman" w:cs="Times New Roman"/>
-          <w:color w:val="444441"/>
         </w:rPr>
         <w:t>belong</w:t>
       </w:r>
       <w:r>
         <w:rPr>
           <w:rFonts w:ascii="Times New Roman" w:hAnsi="Times New Roman" w:cs="Times New Roman"/>
-          <w:color w:val="444441"/>
         </w:rPr>
         <w:t>.</w:t>
       </w:r>
@@ -385,7 +351,6 @@
         <w:rPr>
           <w:rFonts w:ascii="Times New Roman" w:hAnsi="Times New Roman" w:cs="Times New Roman"/>
           <w:b/>
-          <w:color w:val="185FA5"/>
         </w:rPr>
       </w:pPr>
     </w:p>
@@ -395,14 +360,12 @@
         <w:jc w:val="both"/>
         <w:rPr>
           <w:rFonts w:ascii="Times New Roman" w:hAnsi="Times New Roman" w:cs="Times New Roman"/>
-          <w:color w:val="444441"/>
-        </w:rPr>
-      </w:pPr>
-      <w:r>
-        <w:rPr>
-          <w:rFonts w:ascii="Times New Roman" w:hAnsi="Times New Roman" w:cs="Times New Roman"/>
-          <w:b/>
-          <w:color w:val="185FA5"/>
+        </w:rPr>
+      </w:pPr>
+      <w:r>
+        <w:rPr>
+          <w:rFonts w:ascii="Times New Roman" w:hAnsi="Times New Roman" w:cs="Times New Roman"/>
+          <w:b/>
         </w:rPr>
         <w:t>1.2 Representative Information</w:t>
       </w:r>
@@ -418,7 +381,6 @@
       <w:r>
         <w:rPr>
           <w:rFonts w:ascii="Times New Roman" w:hAnsi="Times New Roman" w:cs="Times New Roman"/>
-          <w:color w:val="444441"/>
         </w:rPr>
         <w:t>These fields identify the rep and determine which IC rules apply to them.</w:t>
       </w:r>
@@ -436,14 +398,12 @@
         <w:rPr>
           <w:rFonts w:ascii="Times New Roman" w:hAnsi="Times New Roman" w:cs="Times New Roman"/>
           <w:b/>
-          <w:color w:val="1A3A5C"/>
         </w:rPr>
         <w:t xml:space="preserve">Rep ID — </w:t>
       </w:r>
       <w:r>
         <w:rPr>
           <w:rFonts w:ascii="Times New Roman" w:hAnsi="Times New Roman" w:cs="Times New Roman"/>
-          <w:color w:val="444441"/>
         </w:rPr>
         <w:t>Unique identifier for the sales representative used across all IC systems.</w:t>
       </w:r>
@@ -461,14 +421,12 @@
         <w:rPr>
           <w:rFonts w:ascii="Times New Roman" w:hAnsi="Times New Roman" w:cs="Times New Roman"/>
           <w:b/>
-          <w:color w:val="1A3A5C"/>
         </w:rPr>
         <w:t xml:space="preserve">Rep Name — </w:t>
       </w:r>
       <w:r>
         <w:rPr>
           <w:rFonts w:ascii="Times New Roman" w:hAnsi="Times New Roman" w:cs="Times New Roman"/>
-          <w:color w:val="444441"/>
         </w:rPr>
         <w:t>Full name of the representative.</w:t>
       </w:r>
@@ -486,14 +444,12 @@
         <w:rPr>
           <w:rFonts w:ascii="Times New Roman" w:hAnsi="Times New Roman" w:cs="Times New Roman"/>
           <w:b/>
-          <w:color w:val="1A3A5C"/>
         </w:rPr>
         <w:t xml:space="preserve">Role — </w:t>
       </w:r>
       <w:r>
         <w:rPr>
           <w:rFonts w:ascii="Times New Roman" w:hAnsi="Times New Roman" w:cs="Times New Roman"/>
-          <w:color w:val="444441"/>
         </w:rPr>
         <w:t>Job function of the rep, such as Sales Rep or Manager.</w:t>
       </w:r>
@@ -505,21 +461,18 @@
         <w:jc w:val="both"/>
         <w:rPr>
           <w:rFonts w:ascii="Times New Roman" w:hAnsi="Times New Roman" w:cs="Times New Roman"/>
-          <w:color w:val="444441"/>
-        </w:rPr>
-      </w:pPr>
-      <w:r>
-        <w:rPr>
-          <w:rFonts w:ascii="Times New Roman" w:hAnsi="Times New Roman" w:cs="Times New Roman"/>
-          <w:b/>
-          <w:color w:val="1A3A5C"/>
+        </w:rPr>
+      </w:pPr>
+      <w:r>
+        <w:rPr>
+          <w:rFonts w:ascii="Times New Roman" w:hAnsi="Times New Roman" w:cs="Times New Roman"/>
+          <w:b/>
         </w:rPr>
         <w:t xml:space="preserve">Hire Date — </w:t>
       </w:r>
       <w:r>
         <w:rPr>
           <w:rFonts w:ascii="Times New Roman" w:hAnsi="Times New Roman" w:cs="Times New Roman"/>
-          <w:color w:val="444441"/>
         </w:rPr>
         <w:t>The date the representative officially joined the organization. This is used to calculate new hire eligibility status.</w:t>
       </w:r>
@@ -531,7 +484,6 @@
         <w:rPr>
           <w:rFonts w:ascii="Times New Roman" w:hAnsi="Times New Roman" w:cs="Times New Roman"/>
           <w:b/>
-          <w:color w:val="185FA5"/>
         </w:rPr>
       </w:pPr>
     </w:p>
@@ -541,14 +493,12 @@
         <w:jc w:val="both"/>
         <w:rPr>
           <w:rFonts w:ascii="Times New Roman" w:hAnsi="Times New Roman" w:cs="Times New Roman"/>
-          <w:color w:val="444441"/>
-        </w:rPr>
-      </w:pPr>
-      <w:r>
-        <w:rPr>
-          <w:rFonts w:ascii="Times New Roman" w:hAnsi="Times New Roman" w:cs="Times New Roman"/>
-          <w:b/>
-          <w:color w:val="185FA5"/>
+        </w:rPr>
+      </w:pPr>
+      <w:r>
+        <w:rPr>
+          <w:rFonts w:ascii="Times New Roman" w:hAnsi="Times New Roman" w:cs="Times New Roman"/>
+          <w:b/>
         </w:rPr>
         <w:t>1.3 Eligibility Fields</w:t>
       </w:r>
@@ -564,7 +514,6 @@
       <w:r>
         <w:rPr>
           <w:rFonts w:ascii="Times New Roman" w:hAnsi="Times New Roman" w:cs="Times New Roman"/>
-          <w:color w:val="444441"/>
         </w:rPr>
         <w:t>These fields capture the eligibility status of each rep for a given quarter. All values are computed based on the rep's hire date, tenure, and the IC policy rules for the current plan year.</w:t>
       </w:r>
@@ -576,21 +525,18 @@
         <w:jc w:val="both"/>
         <w:rPr>
           <w:rFonts w:ascii="Times New Roman" w:hAnsi="Times New Roman" w:cs="Times New Roman"/>
-          <w:color w:val="444441"/>
-        </w:rPr>
-      </w:pPr>
-      <w:r>
-        <w:rPr>
-          <w:rFonts w:ascii="Times New Roman" w:hAnsi="Times New Roman" w:cs="Times New Roman"/>
-          <w:b/>
-          <w:color w:val="1A3A5C"/>
+        </w:rPr>
+      </w:pPr>
+      <w:r>
+        <w:rPr>
+          <w:rFonts w:ascii="Times New Roman" w:hAnsi="Times New Roman" w:cs="Times New Roman"/>
+          <w:b/>
         </w:rPr>
         <w:t xml:space="preserve">New Hire Eligible Days — </w:t>
       </w:r>
       <w:r>
         <w:rPr>
           <w:rFonts w:ascii="Times New Roman" w:hAnsi="Times New Roman" w:cs="Times New Roman"/>
-          <w:color w:val="444441"/>
         </w:rPr>
         <w:t>The number of days within the quarter where the rep qualifies under new hire rules.</w:t>
       </w:r>
@@ -608,17 +554,8 @@
         <w:rPr>
           <w:rFonts w:ascii="Times New Roman" w:hAnsi="Times New Roman" w:cs="Times New Roman"/>
           <w:b/>
-          <w:color w:val="1A3A5C"/>
-        </w:rPr>
-        <w:t>New Hire Eligibi</w:t>
-      </w:r>
-      <w:r>
-        <w:rPr>
-          <w:rFonts w:ascii="Times New Roman" w:hAnsi="Times New Roman" w:cs="Times New Roman"/>
-          <w:b/>
-          <w:color w:val="1A3A5C"/>
-        </w:rPr>
-        <w:t>lity –</w:t>
+        </w:rPr>
+        <w:t>New Hire Eligibility –</w:t>
       </w:r>
       <w:r>
         <w:rPr>
@@ -676,35 +613,30 @@
         <w:rPr>
           <w:rFonts w:ascii="Times New Roman" w:hAnsi="Times New Roman" w:cs="Times New Roman"/>
           <w:b/>
-          <w:color w:val="1A3A5C"/>
         </w:rPr>
         <w:t xml:space="preserve">IC Eligible Days — </w:t>
       </w:r>
       <w:r>
         <w:rPr>
           <w:rFonts w:ascii="Times New Roman" w:hAnsi="Times New Roman" w:cs="Times New Roman"/>
-          <w:color w:val="444441"/>
         </w:rPr>
         <w:t xml:space="preserve">The total number of days in the quarter that the rep is </w:t>
       </w:r>
       <w:r>
         <w:rPr>
           <w:rFonts w:ascii="Times New Roman" w:hAnsi="Times New Roman" w:cs="Times New Roman"/>
-          <w:color w:val="444441"/>
         </w:rPr>
         <w:t xml:space="preserve">active in the territory and does not overlap with </w:t>
       </w:r>
       <w:r>
         <w:rPr>
           <w:rFonts w:ascii="Times New Roman" w:hAnsi="Times New Roman" w:cs="Times New Roman"/>
-          <w:color w:val="444441"/>
         </w:rPr>
         <w:t xml:space="preserve">the </w:t>
       </w:r>
       <w:r>
         <w:rPr>
           <w:rFonts w:ascii="Times New Roman" w:hAnsi="Times New Roman" w:cs="Times New Roman"/>
-          <w:color w:val="444441"/>
         </w:rPr>
         <w:t>new hire guarantee period.</w:t>
       </w:r>
@@ -722,14 +654,12 @@
         <w:rPr>
           <w:rFonts w:ascii="Times New Roman" w:hAnsi="Times New Roman" w:cs="Times New Roman"/>
           <w:b/>
-          <w:color w:val="1A3A5C"/>
         </w:rPr>
         <w:t xml:space="preserve">Total Days in QTR — </w:t>
       </w:r>
       <w:r>
         <w:rPr>
           <w:rFonts w:ascii="Times New Roman" w:hAnsi="Times New Roman" w:cs="Times New Roman"/>
-          <w:color w:val="444441"/>
         </w:rPr>
         <w:t>The total number of calendar days in the given quarter. Used as the base denominator for eligibility calculations.</w:t>
       </w:r>
@@ -747,49 +677,42 @@
         <w:rPr>
           <w:rFonts w:ascii="Times New Roman" w:hAnsi="Times New Roman" w:cs="Times New Roman"/>
           <w:b/>
-          <w:color w:val="1A3A5C"/>
         </w:rPr>
         <w:t xml:space="preserve">IC Eligibility — </w:t>
       </w:r>
       <w:r>
         <w:rPr>
           <w:rFonts w:ascii="Times New Roman" w:hAnsi="Times New Roman" w:cs="Times New Roman"/>
-          <w:color w:val="444441"/>
         </w:rPr>
         <w:t>I</w:t>
       </w:r>
       <w:r>
         <w:rPr>
           <w:rFonts w:ascii="Times New Roman" w:hAnsi="Times New Roman" w:cs="Times New Roman"/>
-          <w:color w:val="444441"/>
         </w:rPr>
         <w:t>t is a percentage value that i</w:t>
       </w:r>
       <w:r>
         <w:rPr>
           <w:rFonts w:ascii="Times New Roman" w:hAnsi="Times New Roman" w:cs="Times New Roman"/>
-          <w:color w:val="444441"/>
         </w:rPr>
         <w:t xml:space="preserve">ndicates </w:t>
       </w:r>
       <w:r>
         <w:rPr>
           <w:rFonts w:ascii="Times New Roman" w:hAnsi="Times New Roman" w:cs="Times New Roman"/>
-          <w:color w:val="444441"/>
         </w:rPr>
         <w:t xml:space="preserve">the proportion of quarter where the rep was active in </w:t>
       </w:r>
       <w:r>
         <w:rPr>
           <w:rFonts w:ascii="Times New Roman" w:hAnsi="Times New Roman" w:cs="Times New Roman"/>
-          <w:color w:val="444441"/>
         </w:rPr>
         <w:t xml:space="preserve">the </w:t>
       </w:r>
       <w:r>
         <w:rPr>
           <w:rFonts w:ascii="Times New Roman" w:hAnsi="Times New Roman" w:cs="Times New Roman"/>
-          <w:color w:val="444441"/>
         </w:rPr>
         <w:t>field apart from his new hire period.</w:t>
       </w:r>
@@ -807,7 +730,6 @@
         <w:rPr>
           <w:rFonts w:ascii="Times New Roman" w:hAnsi="Times New Roman" w:cs="Times New Roman"/>
           <w:b/>
-          <w:color w:val="1A3A5C"/>
         </w:rPr>
         <w:t xml:space="preserve">Total </w:t>
       </w:r>
@@ -815,91 +737,78 @@
         <w:rPr>
           <w:rFonts w:ascii="Times New Roman" w:hAnsi="Times New Roman" w:cs="Times New Roman"/>
           <w:b/>
-          <w:color w:val="1A3A5C"/>
         </w:rPr>
         <w:t>Eligibility</w:t>
       </w:r>
       <w:r>
         <w:rPr>
           <w:rFonts w:ascii="Times New Roman" w:hAnsi="Times New Roman" w:cs="Times New Roman"/>
-          <w:color w:val="444441"/>
         </w:rPr>
         <w:t xml:space="preserve"> </w:t>
       </w:r>
       <w:r>
         <w:rPr>
           <w:rFonts w:ascii="Times New Roman" w:hAnsi="Times New Roman" w:cs="Times New Roman"/>
-          <w:color w:val="444441"/>
         </w:rPr>
         <w:t>–</w:t>
       </w:r>
       <w:r>
         <w:rPr>
           <w:rFonts w:ascii="Times New Roman" w:hAnsi="Times New Roman" w:cs="Times New Roman"/>
-          <w:color w:val="444441"/>
         </w:rPr>
         <w:t xml:space="preserve"> </w:t>
       </w:r>
       <w:r>
         <w:rPr>
           <w:rFonts w:ascii="Times New Roman" w:hAnsi="Times New Roman" w:cs="Times New Roman"/>
-          <w:color w:val="444441"/>
         </w:rPr>
         <w:t xml:space="preserve">It </w:t>
       </w:r>
       <w:r>
         <w:rPr>
           <w:rFonts w:ascii="Times New Roman" w:hAnsi="Times New Roman" w:cs="Times New Roman"/>
-          <w:color w:val="444441"/>
         </w:rPr>
         <w:t xml:space="preserve">is </w:t>
       </w:r>
       <w:r>
         <w:rPr>
           <w:rFonts w:ascii="Times New Roman" w:hAnsi="Times New Roman" w:cs="Times New Roman"/>
-          <w:color w:val="444441"/>
         </w:rPr>
         <w:t xml:space="preserve">the </w:t>
       </w:r>
       <w:r>
         <w:rPr>
           <w:rFonts w:ascii="Times New Roman" w:hAnsi="Times New Roman" w:cs="Times New Roman"/>
-          <w:color w:val="444441"/>
         </w:rPr>
         <w:t xml:space="preserve">sum of </w:t>
       </w:r>
       <w:r>
         <w:rPr>
           <w:rFonts w:ascii="Times New Roman" w:hAnsi="Times New Roman" w:cs="Times New Roman"/>
-          <w:color w:val="444441"/>
         </w:rPr>
         <w:t>new hire</w:t>
       </w:r>
       <w:r>
         <w:rPr>
           <w:rFonts w:ascii="Times New Roman" w:hAnsi="Times New Roman" w:cs="Times New Roman"/>
-          <w:color w:val="444441"/>
         </w:rPr>
         <w:t xml:space="preserve"> eligibility</w:t>
       </w:r>
       <w:r>
         <w:rPr>
           <w:rFonts w:ascii="Times New Roman" w:hAnsi="Times New Roman" w:cs="Times New Roman"/>
-          <w:color w:val="444441"/>
         </w:rPr>
         <w:t xml:space="preserve"> and IC </w:t>
       </w:r>
       <w:r>
         <w:rPr>
           <w:rFonts w:ascii="Times New Roman" w:hAnsi="Times New Roman" w:cs="Times New Roman"/>
-          <w:color w:val="444441"/>
         </w:rPr>
         <w:t>eligibility</w:t>
       </w:r>
       <w:r>
         <w:rPr>
           <w:rFonts w:ascii="Times New Roman" w:hAnsi="Times New Roman" w:cs="Times New Roman"/>
-          <w:color w:val="444441"/>
         </w:rPr>
         <w:t xml:space="preserve">. </w:t>
       </w:r>
@@ -911,7 +820,6 @@
         <w:rPr>
           <w:rFonts w:ascii="Times New Roman" w:hAnsi="Times New Roman" w:cs="Times New Roman"/>
           <w:b/>
-          <w:color w:val="1A3A5C"/>
         </w:rPr>
       </w:pPr>
     </w:p>
@@ -927,7 +835,6 @@
         <w:rPr>
           <w:rFonts w:ascii="Times New Roman" w:hAnsi="Times New Roman" w:cs="Times New Roman"/>
           <w:b/>
-          <w:color w:val="185FA5"/>
         </w:rPr>
         <w:t>1.</w:t>
       </w:r>
@@ -935,7 +842,6 @@
         <w:rPr>
           <w:rFonts w:ascii="Times New Roman" w:hAnsi="Times New Roman" w:cs="Times New Roman"/>
           <w:b/>
-          <w:color w:val="185FA5"/>
         </w:rPr>
         <w:t>4</w:t>
       </w:r>
@@ -943,7 +849,6 @@
         <w:rPr>
           <w:rFonts w:ascii="Times New Roman" w:hAnsi="Times New Roman" w:cs="Times New Roman"/>
           <w:b/>
-          <w:color w:val="185FA5"/>
         </w:rPr>
         <w:t xml:space="preserve"> Territory Scope Fields</w:t>
       </w:r>
@@ -959,21 +864,18 @@
       <w:r>
         <w:rPr>
           <w:rFonts w:ascii="Times New Roman" w:hAnsi="Times New Roman" w:cs="Times New Roman"/>
-          <w:color w:val="444441"/>
         </w:rPr>
         <w:t xml:space="preserve">These fields describe the breadth of a rep's assigned </w:t>
       </w:r>
       <w:r>
         <w:rPr>
           <w:rFonts w:ascii="Times New Roman" w:hAnsi="Times New Roman" w:cs="Times New Roman"/>
-          <w:color w:val="444441"/>
         </w:rPr>
         <w:t>coverage</w:t>
       </w:r>
       <w:r>
         <w:rPr>
           <w:rFonts w:ascii="Times New Roman" w:hAnsi="Times New Roman" w:cs="Times New Roman"/>
-          <w:color w:val="444441"/>
         </w:rPr>
         <w:t>.</w:t>
       </w:r>
@@ -991,35 +893,30 @@
         <w:rPr>
           <w:rFonts w:ascii="Times New Roman" w:hAnsi="Times New Roman" w:cs="Times New Roman"/>
           <w:b/>
-          <w:color w:val="1A3A5C"/>
         </w:rPr>
         <w:t xml:space="preserve">No. of Underlying Regions — </w:t>
       </w:r>
       <w:r>
         <w:rPr>
           <w:rFonts w:ascii="Times New Roman" w:hAnsi="Times New Roman" w:cs="Times New Roman"/>
-          <w:color w:val="444441"/>
         </w:rPr>
         <w:t>Number</w:t>
       </w:r>
       <w:r>
         <w:rPr>
           <w:rFonts w:ascii="Times New Roman" w:hAnsi="Times New Roman" w:cs="Times New Roman"/>
-          <w:color w:val="444441"/>
         </w:rPr>
         <w:t xml:space="preserve"> of regions </w:t>
       </w:r>
       <w:r>
         <w:rPr>
           <w:rFonts w:ascii="Times New Roman" w:hAnsi="Times New Roman" w:cs="Times New Roman"/>
-          <w:color w:val="444441"/>
         </w:rPr>
         <w:t>under the specified area</w:t>
       </w:r>
       <w:r>
         <w:rPr>
           <w:rFonts w:ascii="Times New Roman" w:hAnsi="Times New Roman" w:cs="Times New Roman"/>
-          <w:color w:val="444441"/>
         </w:rPr>
         <w:t>.</w:t>
       </w:r>
@@ -1037,28 +934,24 @@
         <w:rPr>
           <w:rFonts w:ascii="Times New Roman" w:hAnsi="Times New Roman" w:cs="Times New Roman"/>
           <w:b/>
-          <w:color w:val="1A3A5C"/>
         </w:rPr>
         <w:t xml:space="preserve">No. of Underlying TSS Territories — </w:t>
       </w:r>
       <w:r>
         <w:rPr>
           <w:rFonts w:ascii="Times New Roman" w:hAnsi="Times New Roman" w:cs="Times New Roman"/>
-          <w:color w:val="444441"/>
         </w:rPr>
         <w:t xml:space="preserve">Number of territories under the </w:t>
       </w:r>
       <w:r>
         <w:rPr>
           <w:rFonts w:ascii="Times New Roman" w:hAnsi="Times New Roman" w:cs="Times New Roman"/>
-          <w:color w:val="444441"/>
         </w:rPr>
         <w:t>region</w:t>
       </w:r>
       <w:r>
         <w:rPr>
           <w:rFonts w:ascii="Times New Roman" w:hAnsi="Times New Roman" w:cs="Times New Roman"/>
-          <w:color w:val="444441"/>
         </w:rPr>
         <w:t>.</w:t>
       </w:r>
@@ -1084,7 +977,6 @@
         <w:rPr>
           <w:rFonts w:ascii="Times New Roman" w:hAnsi="Times New Roman" w:cs="Times New Roman"/>
           <w:b/>
-          <w:color w:val="1A3A5C"/>
         </w:rPr>
         <w:t>SECTION 2: PERFORMANCE AND IC CALCULATIONS</w:t>
       </w:r>
@@ -1095,13 +987,11 @@
         <w:jc w:val="both"/>
         <w:rPr>
           <w:rFonts w:ascii="Times New Roman" w:hAnsi="Times New Roman" w:cs="Times New Roman"/>
-          <w:color w:val="444441"/>
-        </w:rPr>
-      </w:pPr>
-      <w:r>
-        <w:rPr>
-          <w:rFonts w:ascii="Times New Roman" w:hAnsi="Times New Roman" w:cs="Times New Roman"/>
-          <w:color w:val="444441"/>
+        </w:rPr>
+      </w:pPr>
+      <w:r>
+        <w:rPr>
+          <w:rFonts w:ascii="Times New Roman" w:hAnsi="Times New Roman" w:cs="Times New Roman"/>
         </w:rPr>
         <w:t xml:space="preserve">This section defines all performance metrics and the step-by-step formulas used to calculate IC earnings. </w:t>
       </w:r>
@@ -1112,7 +1002,6 @@
         <w:jc w:val="both"/>
         <w:rPr>
           <w:rFonts w:ascii="Times New Roman" w:hAnsi="Times New Roman" w:cs="Times New Roman"/>
-          <w:color w:val="444441"/>
         </w:rPr>
       </w:pPr>
     </w:p>
@@ -1128,7 +1017,6 @@
         <w:rPr>
           <w:rFonts w:ascii="Times New Roman" w:hAnsi="Times New Roman" w:cs="Times New Roman"/>
           <w:b/>
-          <w:color w:val="185FA5"/>
         </w:rPr>
         <w:t>2.1 Performance and Payout Fields</w:t>
       </w:r>
@@ -1146,7 +1034,6 @@
         <w:rPr>
           <w:rFonts w:ascii="Times New Roman" w:hAnsi="Times New Roman" w:cs="Times New Roman"/>
           <w:b/>
-          <w:color w:val="1A3A5C"/>
         </w:rPr>
         <w:t xml:space="preserve">Total </w:t>
       </w:r>
@@ -1155,7 +1042,6 @@
         <w:rPr>
           <w:rFonts w:ascii="Times New Roman" w:hAnsi="Times New Roman" w:cs="Times New Roman"/>
           <w:b/>
-          <w:color w:val="1A3A5C"/>
         </w:rPr>
         <w:t>TRx</w:t>
       </w:r>
@@ -1164,28 +1050,24 @@
         <w:rPr>
           <w:rFonts w:ascii="Times New Roman" w:hAnsi="Times New Roman" w:cs="Times New Roman"/>
           <w:b/>
-          <w:color w:val="1A3A5C"/>
         </w:rPr>
         <w:t xml:space="preserve"> Goal — </w:t>
       </w:r>
       <w:r>
         <w:rPr>
           <w:rFonts w:ascii="Times New Roman" w:hAnsi="Times New Roman" w:cs="Times New Roman"/>
-          <w:color w:val="444441"/>
         </w:rPr>
         <w:t xml:space="preserve">Total target assigned to the </w:t>
       </w:r>
       <w:r>
         <w:rPr>
           <w:rFonts w:ascii="Times New Roman" w:hAnsi="Times New Roman" w:cs="Times New Roman"/>
-          <w:color w:val="444441"/>
         </w:rPr>
         <w:t>territory</w:t>
       </w:r>
       <w:r>
         <w:rPr>
           <w:rFonts w:ascii="Times New Roman" w:hAnsi="Times New Roman" w:cs="Times New Roman"/>
-          <w:color w:val="444441"/>
         </w:rPr>
         <w:t xml:space="preserve"> for the full quarter.</w:t>
       </w:r>
@@ -1203,7 +1085,6 @@
         <w:rPr>
           <w:rFonts w:ascii="Times New Roman" w:hAnsi="Times New Roman" w:cs="Times New Roman"/>
           <w:b/>
-          <w:color w:val="1A3A5C"/>
         </w:rPr>
         <w:t xml:space="preserve">QTD </w:t>
       </w:r>
@@ -1212,7 +1093,6 @@
         <w:rPr>
           <w:rFonts w:ascii="Times New Roman" w:hAnsi="Times New Roman" w:cs="Times New Roman"/>
           <w:b/>
-          <w:color w:val="1A3A5C"/>
         </w:rPr>
         <w:t>TRx</w:t>
       </w:r>
@@ -1221,14 +1101,12 @@
         <w:rPr>
           <w:rFonts w:ascii="Times New Roman" w:hAnsi="Times New Roman" w:cs="Times New Roman"/>
           <w:b/>
-          <w:color w:val="1A3A5C"/>
         </w:rPr>
         <w:t xml:space="preserve"> Goal — </w:t>
       </w:r>
       <w:r>
         <w:rPr>
           <w:rFonts w:ascii="Times New Roman" w:hAnsi="Times New Roman" w:cs="Times New Roman"/>
-          <w:color w:val="444441"/>
         </w:rPr>
         <w:t xml:space="preserve">The quarter-to-date portion of the total </w:t>
       </w:r>
@@ -1236,7 +1114,6 @@
       <w:r>
         <w:rPr>
           <w:rFonts w:ascii="Times New Roman" w:hAnsi="Times New Roman" w:cs="Times New Roman"/>
-          <w:color w:val="444441"/>
         </w:rPr>
         <w:t>TRx</w:t>
       </w:r>
@@ -1244,21 +1121,18 @@
       <w:r>
         <w:rPr>
           <w:rFonts w:ascii="Times New Roman" w:hAnsi="Times New Roman" w:cs="Times New Roman"/>
-          <w:color w:val="444441"/>
         </w:rPr>
         <w:t xml:space="preserve"> goal, pro-rated to the current </w:t>
       </w:r>
       <w:r>
         <w:rPr>
           <w:rFonts w:ascii="Times New Roman" w:hAnsi="Times New Roman" w:cs="Times New Roman"/>
-          <w:color w:val="444441"/>
         </w:rPr>
         <w:t>date</w:t>
       </w:r>
       <w:r>
         <w:rPr>
           <w:rFonts w:ascii="Times New Roman" w:hAnsi="Times New Roman" w:cs="Times New Roman"/>
-          <w:color w:val="444441"/>
         </w:rPr>
         <w:t xml:space="preserve"> in the quarter.</w:t>
       </w:r>
@@ -1276,7 +1150,6 @@
         <w:rPr>
           <w:rFonts w:ascii="Times New Roman" w:hAnsi="Times New Roman" w:cs="Times New Roman"/>
           <w:b/>
-          <w:color w:val="1A3A5C"/>
         </w:rPr>
         <w:t xml:space="preserve">QTD </w:t>
       </w:r>
@@ -1285,7 +1158,6 @@
         <w:rPr>
           <w:rFonts w:ascii="Times New Roman" w:hAnsi="Times New Roman" w:cs="Times New Roman"/>
           <w:b/>
-          <w:color w:val="1A3A5C"/>
         </w:rPr>
         <w:t>TRx</w:t>
       </w:r>
@@ -1294,56 +1166,48 @@
         <w:rPr>
           <w:rFonts w:ascii="Times New Roman" w:hAnsi="Times New Roman" w:cs="Times New Roman"/>
           <w:b/>
-          <w:color w:val="1A3A5C"/>
         </w:rPr>
         <w:t xml:space="preserve"> — </w:t>
       </w:r>
       <w:r>
         <w:rPr>
           <w:rFonts w:ascii="Times New Roman" w:hAnsi="Times New Roman" w:cs="Times New Roman"/>
-          <w:color w:val="444441"/>
         </w:rPr>
         <w:t xml:space="preserve">Actual </w:t>
       </w:r>
       <w:r>
         <w:rPr>
           <w:rFonts w:ascii="Times New Roman" w:hAnsi="Times New Roman" w:cs="Times New Roman"/>
-          <w:color w:val="444441"/>
         </w:rPr>
         <w:t>sales</w:t>
       </w:r>
       <w:r>
         <w:rPr>
           <w:rFonts w:ascii="Times New Roman" w:hAnsi="Times New Roman" w:cs="Times New Roman"/>
-          <w:color w:val="444441"/>
         </w:rPr>
         <w:t xml:space="preserve"> achieved by the </w:t>
       </w:r>
       <w:r>
         <w:rPr>
           <w:rFonts w:ascii="Times New Roman" w:hAnsi="Times New Roman" w:cs="Times New Roman"/>
-          <w:color w:val="444441"/>
         </w:rPr>
         <w:t>territory</w:t>
       </w:r>
       <w:r>
         <w:rPr>
           <w:rFonts w:ascii="Times New Roman" w:hAnsi="Times New Roman" w:cs="Times New Roman"/>
-          <w:color w:val="444441"/>
         </w:rPr>
         <w:t xml:space="preserve"> </w:t>
       </w:r>
       <w:r>
         <w:rPr>
           <w:rFonts w:ascii="Times New Roman" w:hAnsi="Times New Roman" w:cs="Times New Roman"/>
-          <w:color w:val="444441"/>
         </w:rPr>
         <w:t xml:space="preserve">till date, </w:t>
       </w:r>
       <w:r>
         <w:rPr>
           <w:rFonts w:ascii="Times New Roman" w:hAnsi="Times New Roman" w:cs="Times New Roman"/>
-          <w:color w:val="444441"/>
         </w:rPr>
         <w:t xml:space="preserve">this quarter. </w:t>
       </w:r>
@@ -1361,7 +1225,6 @@
         <w:rPr>
           <w:rFonts w:ascii="Times New Roman" w:hAnsi="Times New Roman" w:cs="Times New Roman"/>
           <w:b/>
-          <w:color w:val="1A3A5C"/>
         </w:rPr>
         <w:t xml:space="preserve">QTD </w:t>
       </w:r>
@@ -1370,7 +1233,6 @@
         <w:rPr>
           <w:rFonts w:ascii="Times New Roman" w:hAnsi="Times New Roman" w:cs="Times New Roman"/>
           <w:b/>
-          <w:color w:val="1A3A5C"/>
         </w:rPr>
         <w:t>TRx</w:t>
       </w:r>
@@ -1379,7 +1241,6 @@
         <w:rPr>
           <w:rFonts w:ascii="Times New Roman" w:hAnsi="Times New Roman" w:cs="Times New Roman"/>
           <w:b/>
-          <w:color w:val="1A3A5C"/>
         </w:rPr>
         <w:t xml:space="preserve"> per Territory — </w:t>
       </w:r>
@@ -1387,7 +1248,6 @@
       <w:r>
         <w:rPr>
           <w:rFonts w:ascii="Times New Roman" w:hAnsi="Times New Roman" w:cs="Times New Roman"/>
-          <w:color w:val="444441"/>
         </w:rPr>
         <w:t>TRx</w:t>
       </w:r>
@@ -1395,21 +1255,18 @@
       <w:r>
         <w:rPr>
           <w:rFonts w:ascii="Times New Roman" w:hAnsi="Times New Roman" w:cs="Times New Roman"/>
-          <w:color w:val="444441"/>
         </w:rPr>
         <w:t xml:space="preserve"> achieved per territory in the current quarter</w:t>
       </w:r>
       <w:r>
         <w:rPr>
           <w:rFonts w:ascii="Times New Roman" w:hAnsi="Times New Roman" w:cs="Times New Roman"/>
-          <w:color w:val="444441"/>
         </w:rPr>
         <w:t xml:space="preserve"> for a parent geo</w:t>
       </w:r>
       <w:r>
         <w:rPr>
           <w:rFonts w:ascii="Times New Roman" w:hAnsi="Times New Roman" w:cs="Times New Roman"/>
-          <w:color w:val="444441"/>
         </w:rPr>
         <w:t xml:space="preserve">. </w:t>
       </w:r>
@@ -1427,14 +1284,12 @@
         <w:rPr>
           <w:rFonts w:ascii="Times New Roman" w:hAnsi="Times New Roman" w:cs="Times New Roman"/>
           <w:b/>
-          <w:color w:val="1A3A5C"/>
         </w:rPr>
         <w:t xml:space="preserve">Goal Achievement Rate — </w:t>
       </w:r>
       <w:r>
         <w:rPr>
           <w:rFonts w:ascii="Times New Roman" w:hAnsi="Times New Roman" w:cs="Times New Roman"/>
-          <w:color w:val="444441"/>
         </w:rPr>
         <w:t xml:space="preserve">The ratio of actual </w:t>
       </w:r>
@@ -1442,7 +1297,6 @@
       <w:r>
         <w:rPr>
           <w:rFonts w:ascii="Times New Roman" w:hAnsi="Times New Roman" w:cs="Times New Roman"/>
-          <w:color w:val="444441"/>
         </w:rPr>
         <w:t>TRx</w:t>
       </w:r>
@@ -1450,21 +1304,18 @@
       <w:r>
         <w:rPr>
           <w:rFonts w:ascii="Times New Roman" w:hAnsi="Times New Roman" w:cs="Times New Roman"/>
-          <w:color w:val="444441"/>
         </w:rPr>
         <w:t xml:space="preserve"> to </w:t>
       </w:r>
       <w:r>
         <w:rPr>
           <w:rFonts w:ascii="Times New Roman" w:hAnsi="Times New Roman" w:cs="Times New Roman"/>
-          <w:color w:val="444441"/>
         </w:rPr>
         <w:t xml:space="preserve">QTD </w:t>
       </w:r>
       <w:r>
         <w:rPr>
           <w:rFonts w:ascii="Times New Roman" w:hAnsi="Times New Roman" w:cs="Times New Roman"/>
-          <w:color w:val="444441"/>
         </w:rPr>
         <w:t xml:space="preserve">goal </w:t>
       </w:r>
@@ -1472,7 +1323,6 @@
       <w:r>
         <w:rPr>
           <w:rFonts w:ascii="Times New Roman" w:hAnsi="Times New Roman" w:cs="Times New Roman"/>
-          <w:color w:val="444441"/>
         </w:rPr>
         <w:t>TRx</w:t>
       </w:r>
@@ -1480,7 +1330,6 @@
       <w:r>
         <w:rPr>
           <w:rFonts w:ascii="Times New Roman" w:hAnsi="Times New Roman" w:cs="Times New Roman"/>
-          <w:color w:val="444441"/>
         </w:rPr>
         <w:t xml:space="preserve">. </w:t>
       </w:r>
@@ -1498,28 +1347,24 @@
         <w:rPr>
           <w:rFonts w:ascii="Times New Roman" w:hAnsi="Times New Roman" w:cs="Times New Roman"/>
           <w:b/>
-          <w:color w:val="1A3A5C"/>
         </w:rPr>
         <w:t xml:space="preserve">IC Earnings Rate — </w:t>
       </w:r>
       <w:r>
         <w:rPr>
           <w:rFonts w:ascii="Times New Roman" w:hAnsi="Times New Roman" w:cs="Times New Roman"/>
-          <w:color w:val="444441"/>
         </w:rPr>
         <w:t>The percentage rate applied to the rep's Target Pay</w:t>
       </w:r>
       <w:r>
         <w:rPr>
           <w:rFonts w:ascii="Times New Roman" w:hAnsi="Times New Roman" w:cs="Times New Roman"/>
-          <w:color w:val="444441"/>
         </w:rPr>
         <w:t xml:space="preserve">, calculated via </w:t>
       </w:r>
       <w:r>
         <w:rPr>
           <w:rFonts w:ascii="Times New Roman" w:hAnsi="Times New Roman" w:cs="Times New Roman"/>
-          <w:color w:val="444441"/>
         </w:rPr>
         <w:t>payout grid.</w:t>
       </w:r>
@@ -1537,14 +1382,12 @@
         <w:rPr>
           <w:rFonts w:ascii="Times New Roman" w:hAnsi="Times New Roman" w:cs="Times New Roman"/>
           <w:b/>
-          <w:color w:val="1A3A5C"/>
         </w:rPr>
         <w:t xml:space="preserve">Target Pay — </w:t>
       </w:r>
       <w:r>
         <w:rPr>
           <w:rFonts w:ascii="Times New Roman" w:hAnsi="Times New Roman" w:cs="Times New Roman"/>
-          <w:color w:val="444441"/>
         </w:rPr>
         <w:t>The expected IC payout if the rep achieves exactly 100% of their goal for the period.</w:t>
       </w:r>
@@ -1562,49 +1405,42 @@
         <w:rPr>
           <w:rFonts w:ascii="Times New Roman" w:hAnsi="Times New Roman" w:cs="Times New Roman"/>
           <w:b/>
-          <w:color w:val="1A3A5C"/>
         </w:rPr>
         <w:t xml:space="preserve">IC Earnings Value — </w:t>
       </w:r>
       <w:r>
         <w:rPr>
           <w:rFonts w:ascii="Times New Roman" w:hAnsi="Times New Roman" w:cs="Times New Roman"/>
-          <w:color w:val="444441"/>
         </w:rPr>
         <w:t>These are the calculated earning values as per the geographical performance and c</w:t>
       </w:r>
       <w:r>
         <w:rPr>
           <w:rFonts w:ascii="Times New Roman" w:hAnsi="Times New Roman" w:cs="Times New Roman"/>
-          <w:color w:val="444441"/>
         </w:rPr>
         <w:t xml:space="preserve">alculated </w:t>
       </w:r>
       <w:r>
         <w:rPr>
           <w:rFonts w:ascii="Times New Roman" w:hAnsi="Times New Roman" w:cs="Times New Roman"/>
-          <w:color w:val="444441"/>
         </w:rPr>
         <w:t xml:space="preserve">by </w:t>
       </w:r>
       <w:r>
         <w:rPr>
           <w:rFonts w:ascii="Times New Roman" w:hAnsi="Times New Roman" w:cs="Times New Roman"/>
-          <w:color w:val="444441"/>
         </w:rPr>
         <w:t xml:space="preserve">the </w:t>
       </w:r>
       <w:r>
         <w:rPr>
           <w:rFonts w:ascii="Times New Roman" w:hAnsi="Times New Roman" w:cs="Times New Roman"/>
-          <w:color w:val="444441"/>
         </w:rPr>
         <w:t>product of target</w:t>
       </w:r>
       <w:r>
         <w:rPr>
           <w:rFonts w:ascii="Times New Roman" w:hAnsi="Times New Roman" w:cs="Times New Roman"/>
-          <w:color w:val="444441"/>
         </w:rPr>
         <w:t xml:space="preserve"> pay and the IC earning rate.</w:t>
       </w:r>
@@ -1622,7 +1458,6 @@
         <w:rPr>
           <w:rFonts w:ascii="Times New Roman" w:hAnsi="Times New Roman" w:cs="Times New Roman"/>
           <w:b/>
-          <w:color w:val="1A3A5C"/>
         </w:rPr>
         <w:t xml:space="preserve">Total Projected Incremental </w:t>
       </w:r>
@@ -1631,7 +1466,6 @@
         <w:rPr>
           <w:rFonts w:ascii="Times New Roman" w:hAnsi="Times New Roman" w:cs="Times New Roman"/>
           <w:b/>
-          <w:color w:val="1A3A5C"/>
         </w:rPr>
         <w:t>TRx</w:t>
       </w:r>
@@ -1640,70 +1474,60 @@
         <w:rPr>
           <w:rFonts w:ascii="Times New Roman" w:hAnsi="Times New Roman" w:cs="Times New Roman"/>
           <w:b/>
-          <w:color w:val="1A3A5C"/>
         </w:rPr>
         <w:t xml:space="preserve"> —</w:t>
       </w:r>
       <w:r>
         <w:rPr>
           <w:rFonts w:ascii="Times New Roman" w:hAnsi="Times New Roman" w:cs="Times New Roman"/>
-          <w:color w:val="444441"/>
         </w:rPr>
         <w:t xml:space="preserve">additional </w:t>
       </w:r>
       <w:r>
         <w:rPr>
           <w:rFonts w:ascii="Times New Roman" w:hAnsi="Times New Roman" w:cs="Times New Roman"/>
-          <w:color w:val="444441"/>
         </w:rPr>
         <w:t xml:space="preserve">sales </w:t>
       </w:r>
       <w:r>
         <w:rPr>
           <w:rFonts w:ascii="Times New Roman" w:hAnsi="Times New Roman" w:cs="Times New Roman"/>
-          <w:color w:val="444441"/>
         </w:rPr>
         <w:t xml:space="preserve">the </w:t>
       </w:r>
       <w:r>
         <w:rPr>
           <w:rFonts w:ascii="Times New Roman" w:hAnsi="Times New Roman" w:cs="Times New Roman"/>
-          <w:color w:val="444441"/>
         </w:rPr>
         <w:t>territory</w:t>
       </w:r>
       <w:r>
         <w:rPr>
           <w:rFonts w:ascii="Times New Roman" w:hAnsi="Times New Roman" w:cs="Times New Roman"/>
-          <w:color w:val="444441"/>
         </w:rPr>
         <w:t xml:space="preserve"> </w:t>
       </w:r>
       <w:r>
         <w:rPr>
           <w:rFonts w:ascii="Times New Roman" w:hAnsi="Times New Roman" w:cs="Times New Roman"/>
-          <w:color w:val="444441"/>
         </w:rPr>
         <w:t>makes</w:t>
       </w:r>
       <w:r>
         <w:rPr>
           <w:rFonts w:ascii="Times New Roman" w:hAnsi="Times New Roman" w:cs="Times New Roman"/>
-          <w:color w:val="444441"/>
         </w:rPr>
         <w:t xml:space="preserve"> beyond </w:t>
       </w:r>
       <w:r>
         <w:rPr>
           <w:rFonts w:ascii="Times New Roman" w:hAnsi="Times New Roman" w:cs="Times New Roman"/>
-          <w:color w:val="444441"/>
         </w:rPr>
         <w:t xml:space="preserve">the </w:t>
       </w:r>
       <w:r>
         <w:rPr>
           <w:rFonts w:ascii="Times New Roman" w:hAnsi="Times New Roman" w:cs="Times New Roman"/>
-          <w:color w:val="444441"/>
         </w:rPr>
         <w:t xml:space="preserve">total </w:t>
       </w:r>
@@ -1711,7 +1535,6 @@
       <w:r>
         <w:rPr>
           <w:rFonts w:ascii="Times New Roman" w:hAnsi="Times New Roman" w:cs="Times New Roman"/>
-          <w:color w:val="444441"/>
         </w:rPr>
         <w:t>TRx</w:t>
       </w:r>
@@ -1719,7 +1542,6 @@
       <w:r>
         <w:rPr>
           <w:rFonts w:ascii="Times New Roman" w:hAnsi="Times New Roman" w:cs="Times New Roman"/>
-          <w:color w:val="444441"/>
         </w:rPr>
         <w:t xml:space="preserve"> goal of the quarter.</w:t>
       </w:r>
@@ -1737,28 +1559,24 @@
         <w:rPr>
           <w:rFonts w:ascii="Times New Roman" w:hAnsi="Times New Roman" w:cs="Times New Roman"/>
           <w:b/>
-          <w:color w:val="1A3A5C"/>
         </w:rPr>
         <w:t xml:space="preserve">Commission Rate — </w:t>
       </w:r>
       <w:r>
         <w:rPr>
           <w:rFonts w:ascii="Times New Roman" w:hAnsi="Times New Roman" w:cs="Times New Roman"/>
-          <w:color w:val="444441"/>
         </w:rPr>
         <w:t xml:space="preserve">The dollar </w:t>
       </w:r>
       <w:r>
         <w:rPr>
           <w:rFonts w:ascii="Times New Roman" w:hAnsi="Times New Roman" w:cs="Times New Roman"/>
-          <w:color w:val="444441"/>
         </w:rPr>
         <w:t xml:space="preserve">set </w:t>
       </w:r>
       <w:r>
         <w:rPr>
           <w:rFonts w:ascii="Times New Roman" w:hAnsi="Times New Roman" w:cs="Times New Roman"/>
-          <w:color w:val="444441"/>
         </w:rPr>
         <w:t xml:space="preserve">per incremental </w:t>
       </w:r>
@@ -1766,7 +1584,6 @@
       <w:r>
         <w:rPr>
           <w:rFonts w:ascii="Times New Roman" w:hAnsi="Times New Roman" w:cs="Times New Roman"/>
-          <w:color w:val="444441"/>
         </w:rPr>
         <w:t>TRx</w:t>
       </w:r>
@@ -1774,21 +1591,18 @@
       <w:r>
         <w:rPr>
           <w:rFonts w:ascii="Times New Roman" w:hAnsi="Times New Roman" w:cs="Times New Roman"/>
-          <w:color w:val="444441"/>
         </w:rPr>
         <w:t xml:space="preserve"> for commission earnings, in addition to </w:t>
       </w:r>
       <w:r>
         <w:rPr>
           <w:rFonts w:ascii="Times New Roman" w:hAnsi="Times New Roman" w:cs="Times New Roman"/>
-          <w:color w:val="444441"/>
         </w:rPr>
         <w:t>target pay</w:t>
       </w:r>
       <w:r>
         <w:rPr>
           <w:rFonts w:ascii="Times New Roman" w:hAnsi="Times New Roman" w:cs="Times New Roman"/>
-          <w:color w:val="444441"/>
         </w:rPr>
         <w:t>, it is based on the commission grid.</w:t>
       </w:r>
@@ -1806,14 +1620,12 @@
         <w:rPr>
           <w:rFonts w:ascii="Times New Roman" w:hAnsi="Times New Roman" w:cs="Times New Roman"/>
           <w:b/>
-          <w:color w:val="1A3A5C"/>
         </w:rPr>
         <w:t>Commission Earnings Value —</w:t>
       </w:r>
       <w:r>
         <w:rPr>
           <w:rFonts w:ascii="Times New Roman" w:hAnsi="Times New Roman" w:cs="Times New Roman"/>
-          <w:color w:val="444441"/>
         </w:rPr>
         <w:t xml:space="preserve">The value expected by multiplying the commission rate and the total projected incremental </w:t>
       </w:r>
@@ -1821,7 +1633,6 @@
       <w:r>
         <w:rPr>
           <w:rFonts w:ascii="Times New Roman" w:hAnsi="Times New Roman" w:cs="Times New Roman"/>
-          <w:color w:val="444441"/>
         </w:rPr>
         <w:t>TRx</w:t>
       </w:r>
@@ -1829,7 +1640,6 @@
       <w:r>
         <w:rPr>
           <w:rFonts w:ascii="Times New Roman" w:hAnsi="Times New Roman" w:cs="Times New Roman"/>
-          <w:color w:val="444441"/>
         </w:rPr>
         <w:t>.</w:t>
       </w:r>
@@ -1847,21 +1657,18 @@
         <w:rPr>
           <w:rFonts w:ascii="Times New Roman" w:hAnsi="Times New Roman" w:cs="Times New Roman"/>
           <w:b/>
-          <w:color w:val="1A3A5C"/>
         </w:rPr>
         <w:t xml:space="preserve">Total IC Earnings — </w:t>
       </w:r>
       <w:r>
         <w:rPr>
           <w:rFonts w:ascii="Times New Roman" w:hAnsi="Times New Roman" w:cs="Times New Roman"/>
-          <w:color w:val="444441"/>
         </w:rPr>
         <w:t>The sum of IC Earnings Value and Commission Earnings Value</w:t>
       </w:r>
       <w:r>
         <w:rPr>
           <w:rFonts w:ascii="Times New Roman" w:hAnsi="Times New Roman" w:cs="Times New Roman"/>
-          <w:color w:val="444441"/>
         </w:rPr>
         <w:t>.</w:t>
       </w:r>
@@ -1879,14 +1686,12 @@
         <w:rPr>
           <w:rFonts w:ascii="Times New Roman" w:hAnsi="Times New Roman" w:cs="Times New Roman"/>
           <w:b/>
-          <w:color w:val="1A3A5C"/>
         </w:rPr>
         <w:t xml:space="preserve">QTD IC Earnings Rate — </w:t>
       </w:r>
       <w:r>
         <w:rPr>
           <w:rFonts w:ascii="Times New Roman" w:hAnsi="Times New Roman" w:cs="Times New Roman"/>
-          <w:color w:val="444441"/>
         </w:rPr>
         <w:t>The effective earnings rate achieved so far in the quarter, calculated as Total IC Earnings divided by Target Pay.</w:t>
       </w:r>
@@ -1898,21 +1703,18 @@
         <w:jc w:val="both"/>
         <w:rPr>
           <w:rFonts w:ascii="Times New Roman" w:hAnsi="Times New Roman" w:cs="Times New Roman"/>
-          <w:color w:val="444441"/>
-        </w:rPr>
-      </w:pPr>
-      <w:r>
-        <w:rPr>
-          <w:rFonts w:ascii="Times New Roman" w:hAnsi="Times New Roman" w:cs="Times New Roman"/>
-          <w:b/>
-          <w:color w:val="1A3A5C"/>
+        </w:rPr>
+      </w:pPr>
+      <w:r>
+        <w:rPr>
+          <w:rFonts w:ascii="Times New Roman" w:hAnsi="Times New Roman" w:cs="Times New Roman"/>
+          <w:b/>
         </w:rPr>
         <w:t xml:space="preserve">Total IC Payout — </w:t>
       </w:r>
       <w:r>
         <w:rPr>
           <w:rFonts w:ascii="Times New Roman" w:hAnsi="Times New Roman" w:cs="Times New Roman"/>
-          <w:color w:val="444441"/>
         </w:rPr>
         <w:t xml:space="preserve">The final incentive compensation </w:t>
       </w:r>
@@ -1920,7 +1722,6 @@
       <w:r>
         <w:rPr>
           <w:rFonts w:ascii="Times New Roman" w:hAnsi="Times New Roman" w:cs="Times New Roman"/>
-          <w:color w:val="444441"/>
         </w:rPr>
         <w:t>amount</w:t>
       </w:r>
@@ -1928,28 +1729,24 @@
       <w:r>
         <w:rPr>
           <w:rFonts w:ascii="Times New Roman" w:hAnsi="Times New Roman" w:cs="Times New Roman"/>
-          <w:color w:val="444441"/>
         </w:rPr>
         <w:t xml:space="preserve"> payable to the rep after </w:t>
       </w:r>
       <w:r>
         <w:rPr>
           <w:rFonts w:ascii="Times New Roman" w:hAnsi="Times New Roman" w:cs="Times New Roman"/>
-          <w:color w:val="444441"/>
         </w:rPr>
         <w:t xml:space="preserve">multiplying total IC earnings </w:t>
       </w:r>
       <w:r>
         <w:rPr>
           <w:rFonts w:ascii="Times New Roman" w:hAnsi="Times New Roman" w:cs="Times New Roman"/>
-          <w:color w:val="444441"/>
         </w:rPr>
         <w:t>by</w:t>
       </w:r>
       <w:r>
         <w:rPr>
           <w:rFonts w:ascii="Times New Roman" w:hAnsi="Times New Roman" w:cs="Times New Roman"/>
-          <w:color w:val="444441"/>
         </w:rPr>
         <w:t xml:space="preserve"> eligibility.</w:t>
       </w:r>
@@ -1961,7 +1758,6 @@
         <w:rPr>
           <w:rFonts w:ascii="Times New Roman" w:hAnsi="Times New Roman" w:cs="Times New Roman"/>
           <w:b/>
-          <w:color w:val="1A3A5C"/>
         </w:rPr>
       </w:pPr>
     </w:p>
@@ -1971,14 +1767,12 @@
         <w:jc w:val="both"/>
         <w:rPr>
           <w:rFonts w:ascii="Times New Roman" w:hAnsi="Times New Roman" w:cs="Times New Roman"/>
-          <w:color w:val="444441"/>
-        </w:rPr>
-      </w:pPr>
-      <w:r>
-        <w:rPr>
-          <w:rFonts w:ascii="Times New Roman" w:hAnsi="Times New Roman" w:cs="Times New Roman"/>
-          <w:b/>
-          <w:color w:val="185FA5"/>
+        </w:rPr>
+      </w:pPr>
+      <w:r>
+        <w:rPr>
+          <w:rFonts w:ascii="Times New Roman" w:hAnsi="Times New Roman" w:cs="Times New Roman"/>
+          <w:b/>
         </w:rPr>
         <w:t>2.2 Calculation Formulas</w:t>
       </w:r>
@@ -1994,7 +1788,6 @@
       <w:r>
         <w:rPr>
           <w:rFonts w:ascii="Times New Roman" w:hAnsi="Times New Roman" w:cs="Times New Roman"/>
-          <w:color w:val="444441"/>
         </w:rPr>
         <w:t>Apply these five steps in order. Do not calculate payout before confirming eligibility. All currency values are in USD.</w:t>
       </w:r>
@@ -2006,14 +1799,12 @@
         <w:rPr>
           <w:rFonts w:ascii="Times New Roman" w:hAnsi="Times New Roman" w:cs="Times New Roman"/>
           <w:b/>
-          <w:color w:val="1A3A5C"/>
-        </w:rPr>
-      </w:pPr>
-      <w:r>
-        <w:rPr>
-          <w:rFonts w:ascii="Times New Roman" w:hAnsi="Times New Roman" w:cs="Times New Roman"/>
-          <w:b/>
-          <w:color w:val="1A3A5C"/>
+        </w:rPr>
+      </w:pPr>
+      <w:r>
+        <w:rPr>
+          <w:rFonts w:ascii="Times New Roman" w:hAnsi="Times New Roman" w:cs="Times New Roman"/>
+          <w:b/>
         </w:rPr>
         <w:t xml:space="preserve">Step 1 — Goal Achievement </w:t>
       </w:r>
@@ -2022,7 +1813,6 @@
         <w:rPr>
           <w:rFonts w:ascii="Times New Roman" w:hAnsi="Times New Roman" w:cs="Times New Roman"/>
           <w:b/>
-          <w:color w:val="1A3A5C"/>
         </w:rPr>
         <w:t>Rate</w:t>
       </w:r>
@@ -2030,7 +1820,6 @@
         <w:rPr>
           <w:rFonts w:ascii="Times New Roman" w:hAnsi="Times New Roman" w:cs="Times New Roman"/>
           <w:b/>
-          <w:color w:val="1A3A5C"/>
         </w:rPr>
         <w:t>(</w:t>
       </w:r>
@@ -2039,7 +1828,6 @@
         <w:rPr>
           <w:rFonts w:ascii="Times New Roman" w:hAnsi="Times New Roman" w:cs="Times New Roman"/>
           <w:b/>
-          <w:color w:val="1A3A5C"/>
         </w:rPr>
         <w:t>GAR)</w:t>
       </w:r>
@@ -2047,7 +1835,6 @@
         <w:rPr>
           <w:rFonts w:ascii="Times New Roman" w:hAnsi="Times New Roman" w:cs="Times New Roman"/>
           <w:b/>
-          <w:color w:val="1A3A5C"/>
         </w:rPr>
         <w:t xml:space="preserve">:  </w:t>
       </w:r>
@@ -2064,7 +1851,6 @@
         <w:rPr>
           <w:rFonts w:ascii="Times New Roman" w:hAnsi="Times New Roman" w:cs="Times New Roman"/>
           <w:b/>
-          <w:color w:val="185FA5"/>
         </w:rPr>
         <w:t xml:space="preserve">GAR = QTD </w:t>
       </w:r>
@@ -2073,7 +1859,6 @@
         <w:rPr>
           <w:rFonts w:ascii="Times New Roman" w:hAnsi="Times New Roman" w:cs="Times New Roman"/>
           <w:b/>
-          <w:color w:val="185FA5"/>
         </w:rPr>
         <w:t>TRx</w:t>
       </w:r>
@@ -2082,7 +1867,6 @@
         <w:rPr>
           <w:rFonts w:ascii="Times New Roman" w:hAnsi="Times New Roman" w:cs="Times New Roman"/>
           <w:b/>
-          <w:color w:val="185FA5"/>
         </w:rPr>
         <w:t xml:space="preserve"> ÷ QTD </w:t>
       </w:r>
@@ -2091,7 +1875,6 @@
         <w:rPr>
           <w:rFonts w:ascii="Times New Roman" w:hAnsi="Times New Roman" w:cs="Times New Roman"/>
           <w:b/>
-          <w:color w:val="185FA5"/>
         </w:rPr>
         <w:t>TRx</w:t>
       </w:r>
@@ -2100,7 +1883,6 @@
         <w:rPr>
           <w:rFonts w:ascii="Times New Roman" w:hAnsi="Times New Roman" w:cs="Times New Roman"/>
           <w:b/>
-          <w:color w:val="185FA5"/>
         </w:rPr>
         <w:t xml:space="preserve"> Goal</w:t>
       </w:r>
@@ -2110,29 +1892,18 @@
         <w:spacing w:after="0"/>
         <w:rPr>
           <w:rFonts w:ascii="Times New Roman" w:hAnsi="Times New Roman" w:cs="Times New Roman"/>
-          <w:color w:val="444441"/>
-        </w:rPr>
-      </w:pPr>
-      <w:r>
-        <w:rPr>
-          <w:rFonts w:ascii="Times New Roman" w:hAnsi="Times New Roman" w:cs="Times New Roman"/>
-          <w:b/>
-          <w:color w:val="444441"/>
-        </w:rPr>
-        <w:t xml:space="preserve">     </w:t>
-      </w:r>
-      <w:r>
-        <w:rPr>
-          <w:rFonts w:ascii="Times New Roman" w:hAnsi="Times New Roman" w:cs="Times New Roman"/>
-          <w:b/>
-          <w:color w:val="444441"/>
-        </w:rPr>
-        <w:t xml:space="preserve">Example: </w:t>
-      </w:r>
-      <w:r>
-        <w:rPr>
-          <w:rFonts w:ascii="Times New Roman" w:hAnsi="Times New Roman" w:cs="Times New Roman"/>
-          <w:color w:val="444441"/>
+        </w:rPr>
+      </w:pPr>
+      <w:r>
+        <w:rPr>
+          <w:rFonts w:ascii="Times New Roman" w:hAnsi="Times New Roman" w:cs="Times New Roman"/>
+          <w:b/>
+        </w:rPr>
+        <w:t xml:space="preserve">     Example: </w:t>
+      </w:r>
+      <w:r>
+        <w:rPr>
+          <w:rFonts w:ascii="Times New Roman" w:hAnsi="Times New Roman" w:cs="Times New Roman"/>
         </w:rPr>
         <w:t xml:space="preserve">QTD </w:t>
       </w:r>
@@ -2140,7 +1911,6 @@
       <w:r>
         <w:rPr>
           <w:rFonts w:ascii="Times New Roman" w:hAnsi="Times New Roman" w:cs="Times New Roman"/>
-          <w:color w:val="444441"/>
         </w:rPr>
         <w:t>TRx</w:t>
       </w:r>
@@ -2148,14 +1918,12 @@
       <w:r>
         <w:rPr>
           <w:rFonts w:ascii="Times New Roman" w:hAnsi="Times New Roman" w:cs="Times New Roman"/>
-          <w:color w:val="444441"/>
         </w:rPr>
         <w:t xml:space="preserve"> = 800, Goal = </w:t>
       </w:r>
       <w:r>
         <w:rPr>
           <w:rFonts w:ascii="Times New Roman" w:hAnsi="Times New Roman" w:cs="Times New Roman"/>
-          <w:color w:val="444441"/>
         </w:rPr>
         <w:t xml:space="preserve">1,000 </w:t>
       </w:r>
@@ -2163,14 +1931,12 @@
       <w:r>
         <w:rPr>
           <w:rFonts w:ascii="Times New Roman" w:hAnsi="Times New Roman" w:cs="Times New Roman"/>
-          <w:color w:val="444441"/>
         </w:rPr>
         <w:t>→</w:t>
       </w:r>
       <w:r>
         <w:rPr>
           <w:rFonts w:ascii="Times New Roman" w:hAnsi="Times New Roman" w:cs="Times New Roman"/>
-          <w:color w:val="444441"/>
         </w:rPr>
         <w:t xml:space="preserve">  GAR</w:t>
       </w:r>
@@ -2178,7 +1944,6 @@
       <w:r>
         <w:rPr>
           <w:rFonts w:ascii="Times New Roman" w:hAnsi="Times New Roman" w:cs="Times New Roman"/>
-          <w:color w:val="444441"/>
         </w:rPr>
         <w:t xml:space="preserve"> = 0.80 (80%)</w:t>
       </w:r>
@@ -2198,14 +1963,12 @@
         <w:rPr>
           <w:rFonts w:ascii="Times New Roman" w:hAnsi="Times New Roman" w:cs="Times New Roman"/>
           <w:b/>
-          <w:color w:val="1A3A5C"/>
-        </w:rPr>
-      </w:pPr>
-      <w:r>
-        <w:rPr>
-          <w:rFonts w:ascii="Times New Roman" w:hAnsi="Times New Roman" w:cs="Times New Roman"/>
-          <w:b/>
-          <w:color w:val="1A3A5C"/>
+        </w:rPr>
+      </w:pPr>
+      <w:r>
+        <w:rPr>
+          <w:rFonts w:ascii="Times New Roman" w:hAnsi="Times New Roman" w:cs="Times New Roman"/>
+          <w:b/>
         </w:rPr>
         <w:t xml:space="preserve">Step 2 — IC Earnings Value:  </w:t>
       </w:r>
@@ -2222,7 +1985,6 @@
         <w:rPr>
           <w:rFonts w:ascii="Times New Roman" w:hAnsi="Times New Roman" w:cs="Times New Roman"/>
           <w:b/>
-          <w:color w:val="185FA5"/>
         </w:rPr>
         <w:t>IC Earnings Value = Target Pay × IC Earnings Rate</w:t>
       </w:r>
@@ -2232,43 +1994,30 @@
         <w:spacing w:after="0"/>
         <w:rPr>
           <w:rFonts w:ascii="Times New Roman" w:hAnsi="Times New Roman" w:cs="Times New Roman"/>
-          <w:color w:val="444441"/>
-        </w:rPr>
-      </w:pPr>
-      <w:r>
-        <w:rPr>
-          <w:rFonts w:ascii="Times New Roman" w:hAnsi="Times New Roman" w:cs="Times New Roman"/>
-          <w:b/>
-          <w:color w:val="444441"/>
-        </w:rPr>
-        <w:t xml:space="preserve">     </w:t>
-      </w:r>
-      <w:r>
-        <w:rPr>
-          <w:rFonts w:ascii="Times New Roman" w:hAnsi="Times New Roman" w:cs="Times New Roman"/>
-          <w:b/>
-          <w:color w:val="444441"/>
-        </w:rPr>
-        <w:t xml:space="preserve">Example: </w:t>
-      </w:r>
-      <w:r>
-        <w:rPr>
-          <w:rFonts w:ascii="Times New Roman" w:hAnsi="Times New Roman" w:cs="Times New Roman"/>
-          <w:color w:val="444441"/>
+        </w:rPr>
+      </w:pPr>
+      <w:r>
+        <w:rPr>
+          <w:rFonts w:ascii="Times New Roman" w:hAnsi="Times New Roman" w:cs="Times New Roman"/>
+          <w:b/>
+        </w:rPr>
+        <w:t xml:space="preserve">     Example: </w:t>
+      </w:r>
+      <w:r>
+        <w:rPr>
+          <w:rFonts w:ascii="Times New Roman" w:hAnsi="Times New Roman" w:cs="Times New Roman"/>
         </w:rPr>
         <w:t>Target Pay = $50,000, IC Earnings Rate = 80</w:t>
       </w:r>
       <w:r>
         <w:rPr>
           <w:rFonts w:ascii="Times New Roman" w:hAnsi="Times New Roman" w:cs="Times New Roman"/>
-          <w:color w:val="444441"/>
         </w:rPr>
         <w:t>% → IC</w:t>
       </w:r>
       <w:r>
         <w:rPr>
           <w:rFonts w:ascii="Times New Roman" w:hAnsi="Times New Roman" w:cs="Times New Roman"/>
-          <w:color w:val="444441"/>
         </w:rPr>
         <w:t xml:space="preserve"> Earnings Value = $40,000</w:t>
       </w:r>
@@ -2288,14 +2037,12 @@
         <w:rPr>
           <w:rFonts w:ascii="Times New Roman" w:hAnsi="Times New Roman" w:cs="Times New Roman"/>
           <w:b/>
-          <w:color w:val="1A3A5C"/>
-        </w:rPr>
-      </w:pPr>
-      <w:r>
-        <w:rPr>
-          <w:rFonts w:ascii="Times New Roman" w:hAnsi="Times New Roman" w:cs="Times New Roman"/>
-          <w:b/>
-          <w:color w:val="1A3A5C"/>
+        </w:rPr>
+      </w:pPr>
+      <w:r>
+        <w:rPr>
+          <w:rFonts w:ascii="Times New Roman" w:hAnsi="Times New Roman" w:cs="Times New Roman"/>
+          <w:b/>
         </w:rPr>
         <w:t xml:space="preserve">Step 3 — Commission Earnings Value:  </w:t>
       </w:r>
@@ -2312,7 +2059,6 @@
         <w:rPr>
           <w:rFonts w:ascii="Times New Roman" w:hAnsi="Times New Roman" w:cs="Times New Roman"/>
           <w:b/>
-          <w:color w:val="185FA5"/>
         </w:rPr>
         <w:t xml:space="preserve">Commission Earnings Value = Projected Incremental </w:t>
       </w:r>
@@ -2321,7 +2067,6 @@
         <w:rPr>
           <w:rFonts w:ascii="Times New Roman" w:hAnsi="Times New Roman" w:cs="Times New Roman"/>
           <w:b/>
-          <w:color w:val="185FA5"/>
         </w:rPr>
         <w:t>TRx</w:t>
       </w:r>
@@ -2330,7 +2075,6 @@
         <w:rPr>
           <w:rFonts w:ascii="Times New Roman" w:hAnsi="Times New Roman" w:cs="Times New Roman"/>
           <w:b/>
-          <w:color w:val="185FA5"/>
         </w:rPr>
         <w:t xml:space="preserve"> × Commission Rate</w:t>
       </w:r>
@@ -2340,29 +2084,18 @@
         <w:spacing w:after="0"/>
         <w:rPr>
           <w:rFonts w:ascii="Times New Roman" w:hAnsi="Times New Roman" w:cs="Times New Roman"/>
-          <w:color w:val="444441"/>
-        </w:rPr>
-      </w:pPr>
-      <w:r>
-        <w:rPr>
-          <w:rFonts w:ascii="Times New Roman" w:hAnsi="Times New Roman" w:cs="Times New Roman"/>
-          <w:b/>
-          <w:color w:val="444441"/>
-        </w:rPr>
-        <w:t xml:space="preserve">      </w:t>
-      </w:r>
-      <w:r>
-        <w:rPr>
-          <w:rFonts w:ascii="Times New Roman" w:hAnsi="Times New Roman" w:cs="Times New Roman"/>
-          <w:b/>
-          <w:color w:val="444441"/>
-        </w:rPr>
-        <w:t xml:space="preserve">Example: </w:t>
-      </w:r>
-      <w:r>
-        <w:rPr>
-          <w:rFonts w:ascii="Times New Roman" w:hAnsi="Times New Roman" w:cs="Times New Roman"/>
-          <w:color w:val="444441"/>
+        </w:rPr>
+      </w:pPr>
+      <w:r>
+        <w:rPr>
+          <w:rFonts w:ascii="Times New Roman" w:hAnsi="Times New Roman" w:cs="Times New Roman"/>
+          <w:b/>
+        </w:rPr>
+        <w:t xml:space="preserve">      Example: </w:t>
+      </w:r>
+      <w:r>
+        <w:rPr>
+          <w:rFonts w:ascii="Times New Roman" w:hAnsi="Times New Roman" w:cs="Times New Roman"/>
         </w:rPr>
         <w:t xml:space="preserve">200 Incremental </w:t>
       </w:r>
@@ -2370,7 +2103,6 @@
       <w:r>
         <w:rPr>
           <w:rFonts w:ascii="Times New Roman" w:hAnsi="Times New Roman" w:cs="Times New Roman"/>
-          <w:color w:val="444441"/>
         </w:rPr>
         <w:t>TRx</w:t>
       </w:r>
@@ -2378,7 +2110,6 @@
       <w:r>
         <w:rPr>
           <w:rFonts w:ascii="Times New Roman" w:hAnsi="Times New Roman" w:cs="Times New Roman"/>
-          <w:color w:val="444441"/>
         </w:rPr>
         <w:t xml:space="preserve"> × $10/</w:t>
       </w:r>
@@ -2386,7 +2117,6 @@
       <w:r>
         <w:rPr>
           <w:rFonts w:ascii="Times New Roman" w:hAnsi="Times New Roman" w:cs="Times New Roman"/>
-          <w:color w:val="444441"/>
         </w:rPr>
         <w:t>TRx</w:t>
       </w:r>
@@ -2394,14 +2124,12 @@
       <w:r>
         <w:rPr>
           <w:rFonts w:ascii="Times New Roman" w:hAnsi="Times New Roman" w:cs="Times New Roman"/>
-          <w:color w:val="444441"/>
         </w:rPr>
         <w:t xml:space="preserve"> → Commission</w:t>
       </w:r>
       <w:r>
         <w:rPr>
           <w:rFonts w:ascii="Times New Roman" w:hAnsi="Times New Roman" w:cs="Times New Roman"/>
-          <w:color w:val="444441"/>
         </w:rPr>
         <w:t xml:space="preserve"> Earnings = $2,000</w:t>
       </w:r>
@@ -2421,14 +2149,12 @@
         <w:rPr>
           <w:rFonts w:ascii="Times New Roman" w:hAnsi="Times New Roman" w:cs="Times New Roman"/>
           <w:b/>
-          <w:color w:val="1A3A5C"/>
-        </w:rPr>
-      </w:pPr>
-      <w:r>
-        <w:rPr>
-          <w:rFonts w:ascii="Times New Roman" w:hAnsi="Times New Roman" w:cs="Times New Roman"/>
-          <w:b/>
-          <w:color w:val="1A3A5C"/>
+        </w:rPr>
+      </w:pPr>
+      <w:r>
+        <w:rPr>
+          <w:rFonts w:ascii="Times New Roman" w:hAnsi="Times New Roman" w:cs="Times New Roman"/>
+          <w:b/>
         </w:rPr>
         <w:t xml:space="preserve">Step 4 — Total IC Earnings:  </w:t>
       </w:r>
@@ -2445,7 +2171,6 @@
         <w:rPr>
           <w:rFonts w:ascii="Times New Roman" w:hAnsi="Times New Roman" w:cs="Times New Roman"/>
           <w:b/>
-          <w:color w:val="185FA5"/>
         </w:rPr>
         <w:t>Total IC Earnings = IC Earnings Value + Commission Earnings Value</w:t>
       </w:r>
@@ -2455,30 +2180,19 @@
         <w:spacing w:after="0"/>
         <w:rPr>
           <w:rFonts w:ascii="Times New Roman" w:hAnsi="Times New Roman" w:cs="Times New Roman"/>
-          <w:color w:val="444441"/>
-        </w:rPr>
-      </w:pPr>
-      <w:r>
-        <w:rPr>
-          <w:rFonts w:ascii="Times New Roman" w:hAnsi="Times New Roman" w:cs="Times New Roman"/>
-          <w:b/>
-          <w:color w:val="444441"/>
+        </w:rPr>
+      </w:pPr>
+      <w:r>
+        <w:rPr>
+          <w:rFonts w:ascii="Times New Roman" w:hAnsi="Times New Roman" w:cs="Times New Roman"/>
+          <w:b/>
         </w:rPr>
         <w:lastRenderedPageBreak/>
-        <w:t xml:space="preserve">    </w:t>
-      </w:r>
-      <w:r>
-        <w:rPr>
-          <w:rFonts w:ascii="Times New Roman" w:hAnsi="Times New Roman" w:cs="Times New Roman"/>
-          <w:b/>
-          <w:color w:val="444441"/>
-        </w:rPr>
-        <w:t xml:space="preserve">Example: </w:t>
-      </w:r>
-      <w:r>
-        <w:rPr>
-          <w:rFonts w:ascii="Times New Roman" w:hAnsi="Times New Roman" w:cs="Times New Roman"/>
-          <w:color w:val="444441"/>
+        <w:t xml:space="preserve">    Example: </w:t>
+      </w:r>
+      <w:r>
+        <w:rPr>
+          <w:rFonts w:ascii="Times New Roman" w:hAnsi="Times New Roman" w:cs="Times New Roman"/>
         </w:rPr>
         <w:t>$40,000 + $2,000 = $42,000</w:t>
       </w:r>
@@ -2498,14 +2212,12 @@
         <w:rPr>
           <w:rFonts w:ascii="Times New Roman" w:hAnsi="Times New Roman" w:cs="Times New Roman"/>
           <w:b/>
-          <w:color w:val="1A3A5C"/>
-        </w:rPr>
-      </w:pPr>
-      <w:r>
-        <w:rPr>
-          <w:rFonts w:ascii="Times New Roman" w:hAnsi="Times New Roman" w:cs="Times New Roman"/>
-          <w:b/>
-          <w:color w:val="1A3A5C"/>
+        </w:rPr>
+      </w:pPr>
+      <w:r>
+        <w:rPr>
+          <w:rFonts w:ascii="Times New Roman" w:hAnsi="Times New Roman" w:cs="Times New Roman"/>
+          <w:b/>
         </w:rPr>
         <w:t xml:space="preserve">Step 5 — QTD IC Earnings Rate:  </w:t>
       </w:r>
@@ -2522,7 +2234,6 @@
         <w:rPr>
           <w:rFonts w:ascii="Times New Roman" w:hAnsi="Times New Roman" w:cs="Times New Roman"/>
           <w:b/>
-          <w:color w:val="185FA5"/>
         </w:rPr>
         <w:t>QTD IC Earnings Rate = Total IC Earnings × Target Pay</w:t>
       </w:r>
@@ -2538,24 +2249,324 @@
         <w:rPr>
           <w:rFonts w:ascii="Times New Roman" w:hAnsi="Times New Roman" w:cs="Times New Roman"/>
           <w:b/>
-          <w:color w:val="444441"/>
-        </w:rPr>
-        <w:t xml:space="preserve">     </w:t>
-      </w:r>
-      <w:r>
-        <w:rPr>
-          <w:rFonts w:ascii="Times New Roman" w:hAnsi="Times New Roman" w:cs="Times New Roman"/>
-          <w:b/>
-          <w:color w:val="444441"/>
-        </w:rPr>
-        <w:t xml:space="preserve">Example: </w:t>
-      </w:r>
-      <w:r>
-        <w:rPr>
-          <w:rFonts w:ascii="Times New Roman" w:hAnsi="Times New Roman" w:cs="Times New Roman"/>
-          <w:color w:val="444441"/>
+        </w:rPr>
+        <w:t xml:space="preserve">     Example: </w:t>
+      </w:r>
+      <w:r>
+        <w:rPr>
+          <w:rFonts w:ascii="Times New Roman" w:hAnsi="Times New Roman" w:cs="Times New Roman"/>
         </w:rPr>
         <w:t>$42,000 ÷ $50,000 = 0.84 (84%)</w:t>
+      </w:r>
+    </w:p>
+    <w:p>
+      <w:pPr>
+        <w:spacing w:after="0"/>
+        <w:rPr>
+          <w:rFonts w:ascii="Times New Roman" w:hAnsi="Times New Roman" w:cs="Times New Roman"/>
+        </w:rPr>
+      </w:pPr>
+    </w:p>
+    <w:p>
+      <w:pPr>
+        <w:rPr>
+          <w:rFonts w:ascii="Times New Roman" w:hAnsi="Times New Roman" w:cs="Times New Roman"/>
+        </w:rPr>
+      </w:pPr>
+      <w:r>
+        <w:rPr>
+          <w:rFonts w:ascii="Times New Roman" w:hAnsi="Times New Roman" w:cs="Times New Roman"/>
+          <w:b/>
+          <w:bCs/>
+        </w:rPr>
+        <w:t>Commission Grid</w:t>
+      </w:r>
+    </w:p>
+    <w:p>
+      <w:pPr>
+        <w:rPr>
+          <w:rFonts w:ascii="Times New Roman" w:hAnsi="Times New Roman" w:cs="Times New Roman"/>
+        </w:rPr>
+      </w:pPr>
+      <w:r>
+        <w:rPr>
+          <w:rFonts w:ascii="Times New Roman" w:hAnsi="Times New Roman" w:cs="Times New Roman"/>
+        </w:rPr>
+        <w:t xml:space="preserve">The commission rate depends on the number of </w:t>
+      </w:r>
+      <w:r>
+        <w:rPr>
+          <w:rFonts w:ascii="Times New Roman" w:hAnsi="Times New Roman" w:cs="Times New Roman"/>
+          <w:b/>
+          <w:bCs/>
+        </w:rPr>
+        <w:t xml:space="preserve">incremental </w:t>
+      </w:r>
+      <w:proofErr w:type="spellStart"/>
+      <w:r>
+        <w:rPr>
+          <w:rFonts w:ascii="Times New Roman" w:hAnsi="Times New Roman" w:cs="Times New Roman"/>
+          <w:b/>
+          <w:bCs/>
+        </w:rPr>
+        <w:t>TRx</w:t>
+      </w:r>
+      <w:proofErr w:type="spellEnd"/>
+      <w:r>
+        <w:rPr>
+          <w:rFonts w:ascii="Times New Roman" w:hAnsi="Times New Roman" w:cs="Times New Roman"/>
+        </w:rPr>
+        <w:t xml:space="preserve"> achieved beyond the goal.</w:t>
+      </w:r>
+    </w:p>
+    <w:p>
+      <w:pPr>
+        <w:rPr>
+          <w:rFonts w:ascii="Times New Roman" w:hAnsi="Times New Roman" w:cs="Times New Roman"/>
+        </w:rPr>
+      </w:pPr>
+      <w:r>
+        <w:rPr>
+          <w:rFonts w:ascii="Times New Roman" w:hAnsi="Times New Roman" w:cs="Times New Roman"/>
+        </w:rPr>
+        <w:t xml:space="preserve">0–50 incremental </w:t>
+      </w:r>
+      <w:proofErr w:type="spellStart"/>
+      <w:r>
+        <w:rPr>
+          <w:rFonts w:ascii="Times New Roman" w:hAnsi="Times New Roman" w:cs="Times New Roman"/>
+        </w:rPr>
+        <w:t>TRx</w:t>
+      </w:r>
+      <w:proofErr w:type="spellEnd"/>
+      <w:r>
+        <w:rPr>
+          <w:rFonts w:ascii="Times New Roman" w:hAnsi="Times New Roman" w:cs="Times New Roman"/>
+        </w:rPr>
+        <w:t xml:space="preserve"> → $10 per </w:t>
+      </w:r>
+      <w:proofErr w:type="spellStart"/>
+      <w:r>
+        <w:rPr>
+          <w:rFonts w:ascii="Times New Roman" w:hAnsi="Times New Roman" w:cs="Times New Roman"/>
+        </w:rPr>
+        <w:t>TRx</w:t>
+      </w:r>
+      <w:proofErr w:type="spellEnd"/>
+    </w:p>
+    <w:p>
+      <w:pPr>
+        <w:rPr>
+          <w:rFonts w:ascii="Times New Roman" w:hAnsi="Times New Roman" w:cs="Times New Roman"/>
+        </w:rPr>
+      </w:pPr>
+      <w:r>
+        <w:rPr>
+          <w:rFonts w:ascii="Times New Roman" w:hAnsi="Times New Roman" w:cs="Times New Roman"/>
+        </w:rPr>
+        <w:t xml:space="preserve">51–100 incremental </w:t>
+      </w:r>
+      <w:proofErr w:type="spellStart"/>
+      <w:r>
+        <w:rPr>
+          <w:rFonts w:ascii="Times New Roman" w:hAnsi="Times New Roman" w:cs="Times New Roman"/>
+        </w:rPr>
+        <w:t>TRx</w:t>
+      </w:r>
+      <w:proofErr w:type="spellEnd"/>
+      <w:r>
+        <w:rPr>
+          <w:rFonts w:ascii="Times New Roman" w:hAnsi="Times New Roman" w:cs="Times New Roman"/>
+        </w:rPr>
+        <w:t xml:space="preserve"> → $20 per </w:t>
+      </w:r>
+      <w:proofErr w:type="spellStart"/>
+      <w:r>
+        <w:rPr>
+          <w:rFonts w:ascii="Times New Roman" w:hAnsi="Times New Roman" w:cs="Times New Roman"/>
+        </w:rPr>
+        <w:t>TRx</w:t>
+      </w:r>
+      <w:proofErr w:type="spellEnd"/>
+    </w:p>
+    <w:p>
+      <w:pPr>
+        <w:rPr>
+          <w:rFonts w:ascii="Times New Roman" w:hAnsi="Times New Roman" w:cs="Times New Roman"/>
+        </w:rPr>
+      </w:pPr>
+      <w:r>
+        <w:rPr>
+          <w:rFonts w:ascii="Times New Roman" w:hAnsi="Times New Roman" w:cs="Times New Roman"/>
+        </w:rPr>
+        <w:t xml:space="preserve">More than 100 incremental </w:t>
+      </w:r>
+      <w:proofErr w:type="spellStart"/>
+      <w:r>
+        <w:rPr>
+          <w:rFonts w:ascii="Times New Roman" w:hAnsi="Times New Roman" w:cs="Times New Roman"/>
+        </w:rPr>
+        <w:t>TRx</w:t>
+      </w:r>
+      <w:proofErr w:type="spellEnd"/>
+      <w:r>
+        <w:rPr>
+          <w:rFonts w:ascii="Times New Roman" w:hAnsi="Times New Roman" w:cs="Times New Roman"/>
+        </w:rPr>
+        <w:t xml:space="preserve"> → $30 per </w:t>
+      </w:r>
+      <w:proofErr w:type="spellStart"/>
+      <w:r>
+        <w:rPr>
+          <w:rFonts w:ascii="Times New Roman" w:hAnsi="Times New Roman" w:cs="Times New Roman"/>
+        </w:rPr>
+        <w:t>TRx</w:t>
+      </w:r>
+      <w:proofErr w:type="spellEnd"/>
+    </w:p>
+    <w:p>
+      <w:pPr>
+        <w:rPr>
+          <w:rFonts w:ascii="Times New Roman" w:hAnsi="Times New Roman" w:cs="Times New Roman"/>
+          <w:b/>
+          <w:bCs/>
+        </w:rPr>
+      </w:pPr>
+      <w:r>
+        <w:rPr>
+          <w:rFonts w:ascii="Times New Roman" w:hAnsi="Times New Roman" w:cs="Times New Roman"/>
+          <w:b/>
+          <w:bCs/>
+        </w:rPr>
+        <w:t>Commission Formula</w:t>
+      </w:r>
+    </w:p>
+    <w:p>
+      <w:pPr>
+        <w:rPr>
+          <w:rFonts w:ascii="Times New Roman" w:hAnsi="Times New Roman" w:cs="Times New Roman"/>
+          <w:b/>
+          <w:bCs/>
+        </w:rPr>
+      </w:pPr>
+      <w:r>
+        <w:rPr>
+          <w:rFonts w:ascii="Times New Roman" w:hAnsi="Times New Roman" w:cs="Times New Roman"/>
+          <w:b/>
+          <w:bCs/>
+        </w:rPr>
+        <w:t xml:space="preserve">Commission Earnings = Incremental </w:t>
+      </w:r>
+      <w:proofErr w:type="spellStart"/>
+      <w:r>
+        <w:rPr>
+          <w:rFonts w:ascii="Times New Roman" w:hAnsi="Times New Roman" w:cs="Times New Roman"/>
+          <w:b/>
+          <w:bCs/>
+        </w:rPr>
+        <w:t>TRx</w:t>
+      </w:r>
+      <w:proofErr w:type="spellEnd"/>
+      <w:r>
+        <w:rPr>
+          <w:rFonts w:ascii="Times New Roman" w:hAnsi="Times New Roman" w:cs="Times New Roman"/>
+          <w:b/>
+          <w:bCs/>
+        </w:rPr>
+        <w:t xml:space="preserve"> × Commission Rate</w:t>
+      </w:r>
+    </w:p>
+    <w:p>
+      <w:pPr>
+        <w:rPr>
+          <w:rFonts w:ascii="Times New Roman" w:hAnsi="Times New Roman" w:cs="Times New Roman"/>
+        </w:rPr>
+      </w:pPr>
+      <w:r>
+        <w:rPr>
+          <w:rFonts w:ascii="Times New Roman" w:hAnsi="Times New Roman" w:cs="Times New Roman"/>
+        </w:rPr>
+        <w:t>Examples</w:t>
+      </w:r>
+    </w:p>
+    <w:p>
+      <w:pPr>
+        <w:rPr>
+          <w:rFonts w:ascii="Times New Roman" w:hAnsi="Times New Roman" w:cs="Times New Roman"/>
+        </w:rPr>
+      </w:pPr>
+      <w:r>
+        <w:rPr>
+          <w:rFonts w:ascii="Times New Roman" w:hAnsi="Times New Roman" w:cs="Times New Roman"/>
+        </w:rPr>
+        <w:t>Why is my commission rate $10?</w:t>
+      </w:r>
+    </w:p>
+    <w:p>
+      <w:pPr>
+        <w:rPr>
+          <w:rFonts w:ascii="Times New Roman" w:hAnsi="Times New Roman" w:cs="Times New Roman"/>
+        </w:rPr>
+      </w:pPr>
+      <w:r>
+        <w:rPr>
+          <w:rFonts w:ascii="Times New Roman" w:hAnsi="Times New Roman" w:cs="Times New Roman"/>
+        </w:rPr>
+        <w:t xml:space="preserve">Ans: Because your incremental </w:t>
+      </w:r>
+      <w:proofErr w:type="spellStart"/>
+      <w:r>
+        <w:rPr>
+          <w:rFonts w:ascii="Times New Roman" w:hAnsi="Times New Roman" w:cs="Times New Roman"/>
+        </w:rPr>
+        <w:t>TRx</w:t>
+      </w:r>
+      <w:proofErr w:type="spellEnd"/>
+      <w:r>
+        <w:rPr>
+          <w:rFonts w:ascii="Times New Roman" w:hAnsi="Times New Roman" w:cs="Times New Roman"/>
+        </w:rPr>
+        <w:t xml:space="preserve"> falls between 0 and 50.</w:t>
+      </w:r>
+    </w:p>
+    <w:p>
+      <w:pPr>
+        <w:rPr>
+          <w:rFonts w:ascii="Times New Roman" w:hAnsi="Times New Roman" w:cs="Times New Roman"/>
+        </w:rPr>
+      </w:pPr>
+      <w:r>
+        <w:rPr>
+          <w:rFonts w:ascii="Times New Roman" w:hAnsi="Times New Roman" w:cs="Times New Roman"/>
+        </w:rPr>
+        <w:t>Why is my commission rate $20?</w:t>
+      </w:r>
+    </w:p>
+    <w:p>
+      <w:pPr>
+        <w:rPr>
+          <w:rFonts w:ascii="Times New Roman" w:hAnsi="Times New Roman" w:cs="Times New Roman"/>
+        </w:rPr>
+      </w:pPr>
+      <w:r>
+        <w:rPr>
+          <w:rFonts w:ascii="Times New Roman" w:hAnsi="Times New Roman" w:cs="Times New Roman"/>
+        </w:rPr>
+        <w:t xml:space="preserve">Ans: Because your incremental </w:t>
+      </w:r>
+      <w:proofErr w:type="spellStart"/>
+      <w:r>
+        <w:rPr>
+          <w:rFonts w:ascii="Times New Roman" w:hAnsi="Times New Roman" w:cs="Times New Roman"/>
+        </w:rPr>
+        <w:t>TRx</w:t>
+      </w:r>
+      <w:proofErr w:type="spellEnd"/>
+      <w:r>
+        <w:rPr>
+          <w:rFonts w:ascii="Times New Roman" w:hAnsi="Times New Roman" w:cs="Times New Roman"/>
+        </w:rPr>
+        <w:t xml:space="preserve"> falls between 51 and 100.</w:t>
       </w:r>
     </w:p>
     <w:p>
@@ -2565,7 +2576,6 @@
         <w:rPr>
           <w:rFonts w:ascii="Times New Roman" w:hAnsi="Times New Roman" w:cs="Times New Roman"/>
           <w:b/>
-          <w:color w:val="444441"/>
         </w:rPr>
       </w:pPr>
     </w:p>
@@ -2581,7 +2591,6 @@
         <w:rPr>
           <w:rFonts w:ascii="Times New Roman" w:hAnsi="Times New Roman" w:cs="Times New Roman"/>
           <w:b/>
-          <w:color w:val="1A3A5C"/>
         </w:rPr>
         <w:t>SECTION 3: SALES CREDITING</w:t>
       </w:r>
@@ -2592,7 +2601,6 @@
         <w:jc w:val="both"/>
         <w:rPr>
           <w:rFonts w:ascii="Times New Roman" w:hAnsi="Times New Roman" w:cs="Times New Roman"/>
-          <w:color w:val="444441"/>
         </w:rPr>
       </w:pPr>
     </w:p>
@@ -2608,7 +2616,6 @@
         <w:rPr>
           <w:rFonts w:ascii="Times New Roman" w:hAnsi="Times New Roman" w:cs="Times New Roman"/>
           <w:b/>
-          <w:color w:val="185FA5"/>
         </w:rPr>
         <w:t>3.1 HCP Identification Fields</w:t>
       </w:r>
@@ -2627,7 +2634,6 @@
         <w:rPr>
           <w:rFonts w:ascii="Times New Roman" w:hAnsi="Times New Roman" w:cs="Times New Roman"/>
           <w:b/>
-          <w:color w:val="1A3A5C"/>
         </w:rPr>
         <w:t>territory_id</w:t>
       </w:r>
@@ -2636,28 +2642,24 @@
         <w:rPr>
           <w:rFonts w:ascii="Times New Roman" w:hAnsi="Times New Roman" w:cs="Times New Roman"/>
           <w:b/>
-          <w:color w:val="1A3A5C"/>
         </w:rPr>
         <w:t xml:space="preserve"> — </w:t>
       </w:r>
       <w:r>
         <w:rPr>
           <w:rFonts w:ascii="Times New Roman" w:hAnsi="Times New Roman" w:cs="Times New Roman"/>
-          <w:color w:val="444441"/>
         </w:rPr>
         <w:t>The territory ID linked to the HCP</w:t>
       </w:r>
       <w:r>
         <w:rPr>
           <w:rFonts w:ascii="Times New Roman" w:hAnsi="Times New Roman" w:cs="Times New Roman"/>
-          <w:color w:val="444441"/>
         </w:rPr>
         <w:t xml:space="preserve"> zip</w:t>
       </w:r>
       <w:r>
         <w:rPr>
           <w:rFonts w:ascii="Times New Roman" w:hAnsi="Times New Roman" w:cs="Times New Roman"/>
-          <w:color w:val="444441"/>
         </w:rPr>
         <w:t>.</w:t>
       </w:r>
@@ -2676,7 +2678,6 @@
         <w:rPr>
           <w:rFonts w:ascii="Times New Roman" w:hAnsi="Times New Roman" w:cs="Times New Roman"/>
           <w:b/>
-          <w:color w:val="1A3A5C"/>
         </w:rPr>
         <w:t>hcp_name</w:t>
       </w:r>
@@ -2685,21 +2686,18 @@
         <w:rPr>
           <w:rFonts w:ascii="Times New Roman" w:hAnsi="Times New Roman" w:cs="Times New Roman"/>
           <w:b/>
-          <w:color w:val="1A3A5C"/>
         </w:rPr>
         <w:t xml:space="preserve"> — </w:t>
       </w:r>
       <w:r>
         <w:rPr>
           <w:rFonts w:ascii="Times New Roman" w:hAnsi="Times New Roman" w:cs="Times New Roman"/>
-          <w:color w:val="444441"/>
         </w:rPr>
         <w:t>The full name of the healthcare provider (doctor)</w:t>
       </w:r>
       <w:r>
         <w:rPr>
           <w:rFonts w:ascii="Times New Roman" w:hAnsi="Times New Roman" w:cs="Times New Roman"/>
-          <w:color w:val="444441"/>
         </w:rPr>
         <w:t>.</w:t>
       </w:r>
@@ -2718,7 +2716,6 @@
         <w:rPr>
           <w:rFonts w:ascii="Times New Roman" w:hAnsi="Times New Roman" w:cs="Times New Roman"/>
           <w:b/>
-          <w:color w:val="1A3A5C"/>
         </w:rPr>
         <w:t>npi</w:t>
       </w:r>
@@ -2727,35 +2724,30 @@
         <w:rPr>
           <w:rFonts w:ascii="Times New Roman" w:hAnsi="Times New Roman" w:cs="Times New Roman"/>
           <w:b/>
-          <w:color w:val="1A3A5C"/>
         </w:rPr>
         <w:t xml:space="preserve"> — </w:t>
       </w:r>
       <w:r>
         <w:rPr>
           <w:rFonts w:ascii="Times New Roman" w:hAnsi="Times New Roman" w:cs="Times New Roman"/>
-          <w:color w:val="444441"/>
         </w:rPr>
         <w:t xml:space="preserve">National Provider Identifier. A unique ID </w:t>
       </w:r>
       <w:r>
         <w:rPr>
           <w:rFonts w:ascii="Times New Roman" w:hAnsi="Times New Roman" w:cs="Times New Roman"/>
-          <w:color w:val="444441"/>
         </w:rPr>
         <w:t xml:space="preserve">is </w:t>
       </w:r>
       <w:r>
         <w:rPr>
           <w:rFonts w:ascii="Times New Roman" w:hAnsi="Times New Roman" w:cs="Times New Roman"/>
-          <w:color w:val="444441"/>
         </w:rPr>
         <w:t>assigned to each HCP</w:t>
       </w:r>
       <w:r>
         <w:rPr>
           <w:rFonts w:ascii="Times New Roman" w:hAnsi="Times New Roman" w:cs="Times New Roman"/>
-          <w:color w:val="444441"/>
         </w:rPr>
         <w:t>.</w:t>
       </w:r>
@@ -2774,7 +2766,6 @@
         <w:rPr>
           <w:rFonts w:ascii="Times New Roman" w:hAnsi="Times New Roman" w:cs="Times New Roman"/>
           <w:b/>
-          <w:color w:val="1A3A5C"/>
         </w:rPr>
         <w:t>dermacline_trx</w:t>
       </w:r>
@@ -2783,14 +2774,12 @@
         <w:rPr>
           <w:rFonts w:ascii="Times New Roman" w:hAnsi="Times New Roman" w:cs="Times New Roman"/>
           <w:b/>
-          <w:color w:val="1A3A5C"/>
         </w:rPr>
         <w:t xml:space="preserve"> — </w:t>
       </w:r>
       <w:r>
         <w:rPr>
           <w:rFonts w:ascii="Times New Roman" w:hAnsi="Times New Roman" w:cs="Times New Roman"/>
-          <w:color w:val="444441"/>
         </w:rPr>
         <w:t xml:space="preserve">The number of </w:t>
       </w:r>
@@ -2798,7 +2787,6 @@
       <w:r>
         <w:rPr>
           <w:rFonts w:ascii="Times New Roman" w:hAnsi="Times New Roman" w:cs="Times New Roman"/>
-          <w:color w:val="444441"/>
         </w:rPr>
         <w:t>Dermacline</w:t>
       </w:r>
@@ -2806,7 +2794,6 @@
       <w:r>
         <w:rPr>
           <w:rFonts w:ascii="Times New Roman" w:hAnsi="Times New Roman" w:cs="Times New Roman"/>
-          <w:color w:val="444441"/>
         </w:rPr>
         <w:t xml:space="preserve"> prescriptions written by the HCP in the current period. </w:t>
       </w:r>
@@ -2818,7 +2805,6 @@
         <w:rPr>
           <w:rFonts w:ascii="Times New Roman" w:hAnsi="Times New Roman" w:cs="Times New Roman"/>
           <w:b/>
-          <w:color w:val="1A3A5C"/>
         </w:rPr>
       </w:pPr>
     </w:p>
@@ -2834,7 +2820,6 @@
         <w:rPr>
           <w:rFonts w:ascii="Times New Roman" w:hAnsi="Times New Roman" w:cs="Times New Roman"/>
           <w:b/>
-          <w:color w:val="185FA5"/>
         </w:rPr>
         <w:t>3.2 Specialty and Market Eligibility Fields</w:t>
       </w:r>
@@ -2853,7 +2838,6 @@
         <w:rPr>
           <w:rFonts w:ascii="Times New Roman" w:hAnsi="Times New Roman" w:cs="Times New Roman"/>
           <w:b/>
-          <w:color w:val="1A3A5C"/>
         </w:rPr>
         <w:t>spec_code_close_cm_</w:t>
       </w:r>
@@ -2862,7 +2846,6 @@
         <w:rPr>
           <w:rFonts w:ascii="Times New Roman" w:hAnsi="Times New Roman" w:cs="Times New Roman"/>
           <w:b/>
-          <w:color w:val="1A3A5C"/>
         </w:rPr>
         <w:t>symphony</w:t>
       </w:r>
@@ -2871,14 +2854,12 @@
         <w:rPr>
           <w:rFonts w:ascii="Times New Roman" w:hAnsi="Times New Roman" w:cs="Times New Roman"/>
           <w:b/>
-          <w:color w:val="1A3A5C"/>
         </w:rPr>
         <w:t xml:space="preserve"> —</w:t>
       </w:r>
       <w:r>
         <w:rPr>
           <w:rFonts w:ascii="Times New Roman" w:hAnsi="Times New Roman" w:cs="Times New Roman"/>
-          <w:color w:val="444441"/>
         </w:rPr>
         <w:t>it</w:t>
       </w:r>
@@ -2886,7 +2867,6 @@
       <w:r>
         <w:rPr>
           <w:rFonts w:ascii="Times New Roman" w:hAnsi="Times New Roman" w:cs="Times New Roman"/>
-          <w:color w:val="444441"/>
         </w:rPr>
         <w:t xml:space="preserve"> specifies the HCP’s specialty at the end of the quarter</w:t>
       </w:r>
@@ -2905,7 +2885,6 @@
         <w:rPr>
           <w:rFonts w:ascii="Times New Roman" w:hAnsi="Times New Roman" w:cs="Times New Roman"/>
           <w:b/>
-          <w:color w:val="1A3A5C"/>
         </w:rPr>
         <w:t>primary_flag_close_cm</w:t>
       </w:r>
@@ -2914,42 +2893,36 @@
         <w:rPr>
           <w:rFonts w:ascii="Times New Roman" w:hAnsi="Times New Roman" w:cs="Times New Roman"/>
           <w:b/>
-          <w:color w:val="1A3A5C"/>
         </w:rPr>
         <w:t xml:space="preserve"> — </w:t>
       </w:r>
       <w:r>
         <w:rPr>
           <w:rFonts w:ascii="Times New Roman" w:hAnsi="Times New Roman" w:cs="Times New Roman"/>
-          <w:color w:val="444441"/>
         </w:rPr>
         <w:t>Indicates whether the HCP is marked as the primary</w:t>
       </w:r>
       <w:r>
         <w:rPr>
           <w:rFonts w:ascii="Times New Roman" w:hAnsi="Times New Roman" w:cs="Times New Roman"/>
-          <w:color w:val="444441"/>
         </w:rPr>
         <w:t xml:space="preserve"> at </w:t>
       </w:r>
       <w:r>
         <w:rPr>
           <w:rFonts w:ascii="Times New Roman" w:hAnsi="Times New Roman" w:cs="Times New Roman"/>
-          <w:color w:val="444441"/>
         </w:rPr>
         <w:t xml:space="preserve">the </w:t>
       </w:r>
       <w:r>
         <w:rPr>
           <w:rFonts w:ascii="Times New Roman" w:hAnsi="Times New Roman" w:cs="Times New Roman"/>
-          <w:color w:val="444441"/>
         </w:rPr>
         <w:t>end of the quarter</w:t>
       </w:r>
       <w:r>
         <w:rPr>
           <w:rFonts w:ascii="Times New Roman" w:hAnsi="Times New Roman" w:cs="Times New Roman"/>
-          <w:color w:val="444441"/>
         </w:rPr>
         <w:t>.</w:t>
       </w:r>
@@ -2968,7 +2941,6 @@
         <w:rPr>
           <w:rFonts w:ascii="Times New Roman" w:hAnsi="Times New Roman" w:cs="Times New Roman"/>
           <w:b/>
-          <w:color w:val="1A3A5C"/>
         </w:rPr>
         <w:t>spec_code_open_cm</w:t>
       </w:r>
@@ -2977,30 +2949,20 @@
         <w:rPr>
           <w:rFonts w:ascii="Times New Roman" w:hAnsi="Times New Roman" w:cs="Times New Roman"/>
           <w:b/>
-          <w:color w:val="1A3A5C"/>
         </w:rPr>
         <w:t xml:space="preserve"> —</w:t>
       </w:r>
       <w:r>
         <w:rPr>
           <w:rFonts w:ascii="Times New Roman" w:hAnsi="Times New Roman" w:cs="Times New Roman"/>
-          <w:color w:val="444441"/>
         </w:rPr>
         <w:t xml:space="preserve">validate HCP </w:t>
       </w:r>
       <w:r>
         <w:rPr>
           <w:rFonts w:ascii="Times New Roman" w:hAnsi="Times New Roman" w:cs="Times New Roman"/>
-          <w:color w:val="444441"/>
-        </w:rPr>
-        <w:t>specialty at the start of the quarter</w:t>
-      </w:r>
-      <w:r>
-        <w:rPr>
-          <w:rFonts w:ascii="Times New Roman" w:hAnsi="Times New Roman" w:cs="Times New Roman"/>
-          <w:color w:val="444441"/>
-        </w:rPr>
-        <w:t>.</w:t>
+        </w:rPr>
+        <w:t>specialty at the start of the quarter.</w:t>
       </w:r>
     </w:p>
     <w:p>
@@ -3017,7 +2979,6 @@
         <w:rPr>
           <w:rFonts w:ascii="Times New Roman" w:hAnsi="Times New Roman" w:cs="Times New Roman"/>
           <w:b/>
-          <w:color w:val="1A3A5C"/>
         </w:rPr>
         <w:t>specialty_exception_flag</w:t>
       </w:r>
@@ -3026,14 +2987,12 @@
         <w:rPr>
           <w:rFonts w:ascii="Times New Roman" w:hAnsi="Times New Roman" w:cs="Times New Roman"/>
           <w:b/>
-          <w:color w:val="1A3A5C"/>
         </w:rPr>
         <w:t xml:space="preserve"> — </w:t>
       </w:r>
       <w:r>
         <w:rPr>
           <w:rFonts w:ascii="Times New Roman" w:hAnsi="Times New Roman" w:cs="Times New Roman"/>
-          <w:color w:val="444441"/>
         </w:rPr>
         <w:t>Indicates whether the HCP qualifies for IC crediting under exception rules, even if their specialty does not match the standard approved list.</w:t>
       </w:r>
@@ -3052,7 +3011,6 @@
         <w:rPr>
           <w:rFonts w:ascii="Times New Roman" w:hAnsi="Times New Roman" w:cs="Times New Roman"/>
           <w:b/>
-          <w:color w:val="1A3A5C"/>
         </w:rPr>
         <w:t>call_plan_target</w:t>
       </w:r>
@@ -3061,14 +3019,12 @@
         <w:rPr>
           <w:rFonts w:ascii="Times New Roman" w:hAnsi="Times New Roman" w:cs="Times New Roman"/>
           <w:b/>
-          <w:color w:val="1A3A5C"/>
         </w:rPr>
         <w:t xml:space="preserve"> — </w:t>
       </w:r>
       <w:r>
         <w:rPr>
           <w:rFonts w:ascii="Times New Roman" w:hAnsi="Times New Roman" w:cs="Times New Roman"/>
-          <w:color w:val="444441"/>
         </w:rPr>
         <w:t>It indicates whether HCP is a call plan target or not, 1 indicates it is and 0 indicates it is not a target.</w:t>
       </w:r>
@@ -3087,8 +3043,8 @@
         <w:rPr>
           <w:rFonts w:ascii="Times New Roman" w:hAnsi="Times New Roman" w:cs="Times New Roman"/>
           <w:b/>
-          <w:color w:val="1A3A5C"/>
-        </w:rPr>
+        </w:rPr>
+        <w:lastRenderedPageBreak/>
         <w:t>approved_spec_flag_close_cm</w:t>
       </w:r>
       <w:proofErr w:type="spellEnd"/>
@@ -3096,105 +3052,90 @@
         <w:rPr>
           <w:rFonts w:ascii="Times New Roman" w:hAnsi="Times New Roman" w:cs="Times New Roman"/>
           <w:b/>
-          <w:color w:val="1A3A5C"/>
         </w:rPr>
         <w:t xml:space="preserve"> — </w:t>
       </w:r>
       <w:r>
         <w:rPr>
           <w:rFonts w:ascii="Times New Roman" w:hAnsi="Times New Roman" w:cs="Times New Roman"/>
-          <w:color w:val="444441"/>
         </w:rPr>
         <w:t xml:space="preserve">Indicates whether the HCP's specialty is </w:t>
       </w:r>
       <w:r>
         <w:rPr>
           <w:rFonts w:ascii="Times New Roman" w:hAnsi="Times New Roman" w:cs="Times New Roman"/>
-          <w:color w:val="444441"/>
         </w:rPr>
         <w:t>under</w:t>
       </w:r>
       <w:r>
         <w:rPr>
           <w:rFonts w:ascii="Times New Roman" w:hAnsi="Times New Roman" w:cs="Times New Roman"/>
-          <w:color w:val="444441"/>
         </w:rPr>
         <w:t xml:space="preserve"> </w:t>
       </w:r>
       <w:r>
         <w:rPr>
           <w:rFonts w:ascii="Times New Roman" w:hAnsi="Times New Roman" w:cs="Times New Roman"/>
-          <w:color w:val="444441"/>
         </w:rPr>
         <w:t xml:space="preserve">the </w:t>
       </w:r>
       <w:r>
         <w:rPr>
           <w:rFonts w:ascii="Times New Roman" w:hAnsi="Times New Roman" w:cs="Times New Roman"/>
-          <w:color w:val="444441"/>
         </w:rPr>
         <w:t xml:space="preserve">approved list for IC crediting </w:t>
       </w:r>
       <w:r>
         <w:rPr>
           <w:rFonts w:ascii="Times New Roman" w:hAnsi="Times New Roman" w:cs="Times New Roman"/>
-          <w:color w:val="444441"/>
         </w:rPr>
         <w:t>at end of the quarter</w:t>
       </w:r>
       <w:r>
         <w:rPr>
           <w:rFonts w:ascii="Times New Roman" w:hAnsi="Times New Roman" w:cs="Times New Roman"/>
-          <w:color w:val="444441"/>
         </w:rPr>
         <w:t xml:space="preserve">. </w:t>
       </w:r>
       <w:r>
         <w:rPr>
           <w:rFonts w:ascii="Times New Roman" w:hAnsi="Times New Roman" w:cs="Times New Roman"/>
-          <w:color w:val="444441"/>
         </w:rPr>
         <w:t>1</w:t>
       </w:r>
       <w:r>
         <w:rPr>
           <w:rFonts w:ascii="Times New Roman" w:hAnsi="Times New Roman" w:cs="Times New Roman"/>
-          <w:color w:val="444441"/>
         </w:rPr>
         <w:t xml:space="preserve"> means the specialty qualifies</w:t>
       </w:r>
       <w:r>
         <w:rPr>
           <w:rFonts w:ascii="Times New Roman" w:hAnsi="Times New Roman" w:cs="Times New Roman"/>
-          <w:color w:val="444441"/>
         </w:rPr>
         <w:t xml:space="preserve">, 0 means </w:t>
       </w:r>
       <w:r>
         <w:rPr>
           <w:rFonts w:ascii="Times New Roman" w:hAnsi="Times New Roman" w:cs="Times New Roman"/>
-          <w:color w:val="444441"/>
         </w:rPr>
         <w:t>don’t</w:t>
       </w:r>
       <w:r>
         <w:rPr>
           <w:rFonts w:ascii="Times New Roman" w:hAnsi="Times New Roman" w:cs="Times New Roman"/>
-          <w:color w:val="444441"/>
         </w:rPr>
         <w:t xml:space="preserve"> </w:t>
       </w:r>
       <w:r>
         <w:rPr>
           <w:rFonts w:ascii="Times New Roman" w:hAnsi="Times New Roman" w:cs="Times New Roman"/>
-          <w:color w:val="444441"/>
         </w:rPr>
         <w:t>qualify</w:t>
       </w:r>
       <w:r>
         <w:rPr>
           <w:rFonts w:ascii="Times New Roman" w:hAnsi="Times New Roman" w:cs="Times New Roman"/>
-          <w:color w:val="444441"/>
         </w:rPr>
         <w:t>.</w:t>
       </w:r>
@@ -3213,7 +3154,6 @@
         <w:rPr>
           <w:rFonts w:ascii="Times New Roman" w:hAnsi="Times New Roman" w:cs="Times New Roman"/>
           <w:b/>
-          <w:color w:val="1A3A5C"/>
         </w:rPr>
         <w:t>approved_spec_flag_open_cm</w:t>
       </w:r>
@@ -3222,58 +3162,32 @@
         <w:rPr>
           <w:rFonts w:ascii="Times New Roman" w:hAnsi="Times New Roman" w:cs="Times New Roman"/>
           <w:b/>
-          <w:color w:val="1A3A5C"/>
         </w:rPr>
         <w:t xml:space="preserve"> — </w:t>
       </w:r>
       <w:r>
         <w:rPr>
           <w:rFonts w:ascii="Times New Roman" w:hAnsi="Times New Roman" w:cs="Times New Roman"/>
-          <w:color w:val="444441"/>
         </w:rPr>
         <w:t>Indicates whether the HCP's specialty is on the approved list for IC crediting</w:t>
       </w:r>
       <w:r>
         <w:rPr>
           <w:rFonts w:ascii="Times New Roman" w:hAnsi="Times New Roman" w:cs="Times New Roman"/>
-          <w:color w:val="444441"/>
         </w:rPr>
         <w:t xml:space="preserve"> at start of the quarter</w:t>
       </w:r>
       <w:r>
         <w:rPr>
           <w:rFonts w:ascii="Times New Roman" w:hAnsi="Times New Roman" w:cs="Times New Roman"/>
-          <w:color w:val="444441"/>
         </w:rPr>
         <w:t xml:space="preserve">. </w:t>
       </w:r>
       <w:r>
         <w:rPr>
           <w:rFonts w:ascii="Times New Roman" w:hAnsi="Times New Roman" w:cs="Times New Roman"/>
-          <w:color w:val="444441"/>
-        </w:rPr>
-        <w:t>1</w:t>
-      </w:r>
-      <w:r>
-        <w:rPr>
-          <w:rFonts w:ascii="Times New Roman" w:hAnsi="Times New Roman" w:cs="Times New Roman"/>
-          <w:color w:val="444441"/>
-        </w:rPr>
-        <w:t xml:space="preserve"> means the specialty qualifies</w:t>
-      </w:r>
-      <w:r>
-        <w:rPr>
-          <w:rFonts w:ascii="Times New Roman" w:hAnsi="Times New Roman" w:cs="Times New Roman"/>
-          <w:color w:val="444441"/>
-        </w:rPr>
-        <w:t>, 0 means don’t qualify</w:t>
-      </w:r>
-      <w:r>
-        <w:rPr>
-          <w:rFonts w:ascii="Times New Roman" w:hAnsi="Times New Roman" w:cs="Times New Roman"/>
-          <w:color w:val="444441"/>
-        </w:rPr>
-        <w:t>.</w:t>
+        </w:rPr>
+        <w:t>1 means the specialty qualifies, 0 means don’t qualify.</w:t>
       </w:r>
     </w:p>
     <w:p>
@@ -3298,7 +3212,6 @@
         <w:rPr>
           <w:rFonts w:ascii="Times New Roman" w:hAnsi="Times New Roman" w:cs="Times New Roman"/>
           <w:b/>
-          <w:color w:val="185FA5"/>
         </w:rPr>
         <w:t>3.3 Approval and Final Flag Fields</w:t>
       </w:r>
@@ -3314,7 +3227,6 @@
       <w:r>
         <w:rPr>
           <w:rFonts w:ascii="Times New Roman" w:hAnsi="Times New Roman" w:cs="Times New Roman"/>
-          <w:color w:val="444441"/>
         </w:rPr>
         <w:t xml:space="preserve">These three flags are the final gatekeepers for whether an HCP's </w:t>
       </w:r>
@@ -3322,7 +3234,6 @@
       <w:r>
         <w:rPr>
           <w:rFonts w:ascii="Times New Roman" w:hAnsi="Times New Roman" w:cs="Times New Roman"/>
-          <w:color w:val="444441"/>
         </w:rPr>
         <w:t>TRx</w:t>
       </w:r>
@@ -3330,49 +3241,42 @@
       <w:r>
         <w:rPr>
           <w:rFonts w:ascii="Times New Roman" w:hAnsi="Times New Roman" w:cs="Times New Roman"/>
-          <w:color w:val="444441"/>
         </w:rPr>
         <w:t xml:space="preserve"> counts toward a rep's IC payout. A</w:t>
       </w:r>
       <w:r>
         <w:rPr>
           <w:rFonts w:ascii="Times New Roman" w:hAnsi="Times New Roman" w:cs="Times New Roman"/>
-          <w:color w:val="444441"/>
         </w:rPr>
         <w:t>ny</w:t>
       </w:r>
       <w:r>
         <w:rPr>
           <w:rFonts w:ascii="Times New Roman" w:hAnsi="Times New Roman" w:cs="Times New Roman"/>
-          <w:color w:val="444441"/>
         </w:rPr>
         <w:t xml:space="preserve"> </w:t>
       </w:r>
       <w:r>
         <w:rPr>
           <w:rFonts w:ascii="Times New Roman" w:hAnsi="Times New Roman" w:cs="Times New Roman"/>
-          <w:color w:val="444441"/>
         </w:rPr>
         <w:t xml:space="preserve">of these </w:t>
       </w:r>
       <w:r>
         <w:rPr>
           <w:rFonts w:ascii="Times New Roman" w:hAnsi="Times New Roman" w:cs="Times New Roman"/>
-          <w:color w:val="444441"/>
         </w:rPr>
         <w:t xml:space="preserve">must be </w:t>
       </w:r>
       <w:r>
         <w:rPr>
           <w:rFonts w:ascii="Times New Roman" w:hAnsi="Times New Roman" w:cs="Times New Roman"/>
-          <w:color w:val="444441"/>
         </w:rPr>
         <w:t>1</w:t>
       </w:r>
       <w:r>
         <w:rPr>
           <w:rFonts w:ascii="Times New Roman" w:hAnsi="Times New Roman" w:cs="Times New Roman"/>
-          <w:color w:val="444441"/>
         </w:rPr>
         <w:t>.</w:t>
       </w:r>
@@ -3391,7 +3295,6 @@
         <w:rPr>
           <w:rFonts w:ascii="Times New Roman" w:hAnsi="Times New Roman" w:cs="Times New Roman"/>
           <w:b/>
-          <w:color w:val="1A3A5C"/>
         </w:rPr>
         <w:t>eligibility_flag</w:t>
       </w:r>
@@ -3400,14 +3303,12 @@
         <w:rPr>
           <w:rFonts w:ascii="Times New Roman" w:hAnsi="Times New Roman" w:cs="Times New Roman"/>
           <w:b/>
-          <w:color w:val="1A3A5C"/>
         </w:rPr>
         <w:t xml:space="preserve"> — </w:t>
       </w:r>
       <w:r>
         <w:rPr>
           <w:rFonts w:ascii="Times New Roman" w:hAnsi="Times New Roman" w:cs="Times New Roman"/>
-          <w:color w:val="444441"/>
         </w:rPr>
         <w:t xml:space="preserve">The indicator of whether the HCP meets the base eligibility criteria for IC crediting. </w:t>
       </w:r>
@@ -3420,7 +3321,6 @@
         <w:rPr>
           <w:rFonts w:ascii="Times New Roman" w:hAnsi="Times New Roman" w:cs="Times New Roman"/>
           <w:b/>
-          <w:color w:val="1A3A5C"/>
         </w:rPr>
       </w:pPr>
       <w:proofErr w:type="spellStart"/>
@@ -3428,7 +3328,6 @@
         <w:rPr>
           <w:rFonts w:ascii="Times New Roman" w:hAnsi="Times New Roman" w:cs="Times New Roman"/>
           <w:b/>
-          <w:color w:val="1A3A5C"/>
         </w:rPr>
         <w:t>approval_flag</w:t>
       </w:r>
@@ -3437,107 +3336,75 @@
         <w:rPr>
           <w:rFonts w:ascii="Times New Roman" w:hAnsi="Times New Roman" w:cs="Times New Roman"/>
           <w:b/>
-          <w:color w:val="1A3A5C"/>
         </w:rPr>
         <w:t xml:space="preserve"> — </w:t>
       </w:r>
       <w:r>
         <w:rPr>
           <w:rFonts w:ascii="Times New Roman" w:hAnsi="Times New Roman" w:cs="Times New Roman"/>
-          <w:color w:val="444441"/>
         </w:rPr>
         <w:t>Indicates whether the HCP has passed all approval validations required for IC inclusion.</w:t>
       </w:r>
       <w:r>
         <w:rPr>
           <w:rFonts w:ascii="Times New Roman" w:hAnsi="Times New Roman" w:cs="Times New Roman"/>
-          <w:color w:val="444441"/>
-        </w:rPr>
-        <w:t xml:space="preserve"> It is 1 when any of thes</w:t>
-      </w:r>
-      <w:r>
-        <w:rPr>
-          <w:rFonts w:ascii="Times New Roman" w:hAnsi="Times New Roman" w:cs="Times New Roman"/>
-          <w:color w:val="444441"/>
-        </w:rPr>
-        <w:t>e</w:t>
-      </w:r>
-      <w:r>
-        <w:rPr>
-          <w:rFonts w:ascii="Times New Roman" w:hAnsi="Times New Roman" w:cs="Times New Roman"/>
-          <w:color w:val="444441"/>
+        </w:rPr>
+        <w:t xml:space="preserve"> It is 1 when any of these (</w:t>
+      </w:r>
+      <w:proofErr w:type="spellStart"/>
+      <w:r>
+        <w:rPr>
+          <w:rFonts w:ascii="Times New Roman" w:hAnsi="Times New Roman" w:cs="Times New Roman"/>
+        </w:rPr>
+        <w:t>approved_spec_flag_open_cm</w:t>
+      </w:r>
+      <w:proofErr w:type="spellEnd"/>
+      <w:r>
+        <w:rPr>
+          <w:rFonts w:ascii="Times New Roman" w:hAnsi="Times New Roman" w:cs="Times New Roman"/>
+        </w:rPr>
+        <w:t xml:space="preserve">, </w:t>
+      </w:r>
+      <w:proofErr w:type="spellStart"/>
+      <w:r>
+        <w:rPr>
+          <w:rFonts w:ascii="Times New Roman" w:hAnsi="Times New Roman" w:cs="Times New Roman"/>
+        </w:rPr>
+        <w:t>approved_spec_flag_close_cm</w:t>
+      </w:r>
+      <w:proofErr w:type="spellEnd"/>
+      <w:r>
+        <w:rPr>
+          <w:rFonts w:ascii="Times New Roman" w:hAnsi="Times New Roman" w:cs="Times New Roman"/>
+        </w:rPr>
+        <w:t>,</w:t>
+      </w:r>
+      <w:r>
+        <w:rPr>
+          <w:rFonts w:ascii="Times New Roman" w:hAnsi="Times New Roman" w:cs="Times New Roman"/>
+          <w:b/>
         </w:rPr>
         <w:t xml:space="preserve"> </w:t>
       </w:r>
-      <w:r>
-        <w:rPr>
-          <w:rFonts w:ascii="Times New Roman" w:hAnsi="Times New Roman" w:cs="Times New Roman"/>
-          <w:color w:val="444441"/>
-        </w:rPr>
-        <w:t>(</w:t>
-      </w:r>
       <w:proofErr w:type="spellStart"/>
       <w:r>
         <w:rPr>
           <w:rFonts w:ascii="Times New Roman" w:hAnsi="Times New Roman" w:cs="Times New Roman"/>
-          <w:color w:val="1A3A5C"/>
-        </w:rPr>
-        <w:t>approved_spec_flag_open_cm</w:t>
+          <w:bCs/>
+        </w:rPr>
+        <w:t>specialty_exception_flag</w:t>
       </w:r>
       <w:proofErr w:type="spellEnd"/>
       <w:r>
         <w:rPr>
           <w:rFonts w:ascii="Times New Roman" w:hAnsi="Times New Roman" w:cs="Times New Roman"/>
-          <w:color w:val="1A3A5C"/>
-        </w:rPr>
-        <w:t xml:space="preserve">, </w:t>
-      </w:r>
-      <w:proofErr w:type="spellStart"/>
-      <w:r>
-        <w:rPr>
-          <w:rFonts w:ascii="Times New Roman" w:hAnsi="Times New Roman" w:cs="Times New Roman"/>
-          <w:color w:val="1A3A5C"/>
-        </w:rPr>
-        <w:t>approved_spec_flag_close_cm</w:t>
-      </w:r>
-      <w:proofErr w:type="spellEnd"/>
-      <w:r>
-        <w:rPr>
-          <w:rFonts w:ascii="Times New Roman" w:hAnsi="Times New Roman" w:cs="Times New Roman"/>
-          <w:color w:val="1A3A5C"/>
-        </w:rPr>
-        <w:t>,</w:t>
-      </w:r>
-      <w:r>
-        <w:rPr>
-          <w:rFonts w:ascii="Times New Roman" w:hAnsi="Times New Roman" w:cs="Times New Roman"/>
-          <w:b/>
-          <w:color w:val="1A3A5C"/>
-        </w:rPr>
-        <w:t xml:space="preserve"> </w:t>
-      </w:r>
-      <w:proofErr w:type="spellStart"/>
-      <w:r>
-        <w:rPr>
-          <w:rFonts w:ascii="Times New Roman" w:hAnsi="Times New Roman" w:cs="Times New Roman"/>
           <w:bCs/>
-          <w:color w:val="1A3A5C"/>
-        </w:rPr>
-        <w:t>specialty_exception_flag</w:t>
-      </w:r>
-      <w:proofErr w:type="spellEnd"/>
-      <w:r>
-        <w:rPr>
-          <w:rFonts w:ascii="Times New Roman" w:hAnsi="Times New Roman" w:cs="Times New Roman"/>
-          <w:bCs/>
-          <w:color w:val="1A3A5C"/>
         </w:rPr>
         <w:t>)</w:t>
       </w:r>
       <w:r>
         <w:rPr>
           <w:rFonts w:ascii="Times New Roman" w:hAnsi="Times New Roman" w:cs="Times New Roman"/>
-          <w:color w:val="1A3A5C"/>
         </w:rPr>
         <w:t xml:space="preserve"> is 1</w:t>
       </w:r>
@@ -3556,7 +3423,6 @@
         <w:rPr>
           <w:rFonts w:ascii="Times New Roman" w:hAnsi="Times New Roman" w:cs="Times New Roman"/>
           <w:b/>
-          <w:color w:val="1A3A5C"/>
         </w:rPr>
         <w:t>final_ic_cm_flag</w:t>
       </w:r>
@@ -3565,14 +3431,12 @@
         <w:rPr>
           <w:rFonts w:ascii="Times New Roman" w:hAnsi="Times New Roman" w:cs="Times New Roman"/>
           <w:b/>
-          <w:color w:val="1A3A5C"/>
         </w:rPr>
         <w:t xml:space="preserve"> — </w:t>
       </w:r>
       <w:r>
         <w:rPr>
           <w:rFonts w:ascii="Times New Roman" w:hAnsi="Times New Roman" w:cs="Times New Roman"/>
-          <w:color w:val="444441"/>
         </w:rPr>
         <w:t xml:space="preserve">The final confirmation flag that the HCP's </w:t>
       </w:r>
@@ -3580,7 +3444,6 @@
       <w:r>
         <w:rPr>
           <w:rFonts w:ascii="Times New Roman" w:hAnsi="Times New Roman" w:cs="Times New Roman"/>
-          <w:color w:val="444441"/>
         </w:rPr>
         <w:t>TRx</w:t>
       </w:r>
@@ -3588,28 +3451,24 @@
       <w:r>
         <w:rPr>
           <w:rFonts w:ascii="Times New Roman" w:hAnsi="Times New Roman" w:cs="Times New Roman"/>
-          <w:color w:val="444441"/>
         </w:rPr>
         <w:t xml:space="preserve"> is </w:t>
       </w:r>
       <w:r>
         <w:rPr>
           <w:rFonts w:ascii="Times New Roman" w:hAnsi="Times New Roman" w:cs="Times New Roman"/>
-          <w:color w:val="444441"/>
         </w:rPr>
         <w:t>credited for</w:t>
       </w:r>
       <w:r>
         <w:rPr>
           <w:rFonts w:ascii="Times New Roman" w:hAnsi="Times New Roman" w:cs="Times New Roman"/>
-          <w:color w:val="444441"/>
         </w:rPr>
         <w:t xml:space="preserve"> IC payout calculations</w:t>
       </w:r>
       <w:r>
         <w:rPr>
           <w:rFonts w:ascii="Times New Roman" w:hAnsi="Times New Roman" w:cs="Times New Roman"/>
-          <w:color w:val="444441"/>
         </w:rPr>
         <w:t xml:space="preserve"> or not. It is 1 if </w:t>
       </w:r>
@@ -3617,7 +3476,6 @@
       <w:r>
         <w:rPr>
           <w:rFonts w:ascii="Times New Roman" w:hAnsi="Times New Roman" w:cs="Times New Roman"/>
-          <w:color w:val="444441"/>
         </w:rPr>
         <w:t>any of</w:t>
       </w:r>
@@ -3625,21 +3483,18 @@
       <w:r>
         <w:rPr>
           <w:rFonts w:ascii="Times New Roman" w:hAnsi="Times New Roman" w:cs="Times New Roman"/>
-          <w:color w:val="444441"/>
         </w:rPr>
         <w:t xml:space="preserve"> approval flag or </w:t>
       </w:r>
       <w:r>
         <w:rPr>
           <w:rFonts w:ascii="Times New Roman" w:hAnsi="Times New Roman" w:cs="Times New Roman"/>
-          <w:color w:val="444441"/>
         </w:rPr>
         <w:t xml:space="preserve">the </w:t>
       </w:r>
       <w:r>
         <w:rPr>
           <w:rFonts w:ascii="Times New Roman" w:hAnsi="Times New Roman" w:cs="Times New Roman"/>
-          <w:color w:val="444441"/>
         </w:rPr>
         <w:t xml:space="preserve">call plan target flag is 1. </w:t>
       </w:r>
@@ -3651,7 +3506,6 @@
         <w:rPr>
           <w:rFonts w:ascii="Times New Roman" w:hAnsi="Times New Roman" w:cs="Times New Roman"/>
           <w:b/>
-          <w:color w:val="1A3A5C"/>
         </w:rPr>
       </w:pPr>
     </w:p>
@@ -3667,7 +3521,6 @@
         <w:rPr>
           <w:rFonts w:ascii="Times New Roman" w:hAnsi="Times New Roman" w:cs="Times New Roman"/>
           <w:b/>
-          <w:color w:val="185FA5"/>
         </w:rPr>
         <w:t>3.4 Assignment and Credit Fields</w:t>
       </w:r>
@@ -3686,7 +3539,6 @@
         <w:rPr>
           <w:rFonts w:ascii="Times New Roman" w:hAnsi="Times New Roman" w:cs="Times New Roman"/>
           <w:b/>
-          <w:color w:val="1A3A5C"/>
         </w:rPr>
         <w:t>assignment_emp</w:t>
       </w:r>
@@ -3695,14 +3547,12 @@
         <w:rPr>
           <w:rFonts w:ascii="Times New Roman" w:hAnsi="Times New Roman" w:cs="Times New Roman"/>
           <w:b/>
-          <w:color w:val="1A3A5C"/>
         </w:rPr>
         <w:t xml:space="preserve"> — </w:t>
       </w:r>
       <w:r>
         <w:rPr>
           <w:rFonts w:ascii="Times New Roman" w:hAnsi="Times New Roman" w:cs="Times New Roman"/>
-          <w:color w:val="444441"/>
         </w:rPr>
         <w:t>The sales representative assigned to receive credit for this HCP's prescriptions.</w:t>
       </w:r>
@@ -3721,7 +3571,6 @@
         <w:rPr>
           <w:rFonts w:ascii="Times New Roman" w:hAnsi="Times New Roman" w:cs="Times New Roman"/>
           <w:b/>
-          <w:color w:val="1A3A5C"/>
         </w:rPr>
         <w:t>assignment_pct</w:t>
       </w:r>
@@ -3730,14 +3579,12 @@
         <w:rPr>
           <w:rFonts w:ascii="Times New Roman" w:hAnsi="Times New Roman" w:cs="Times New Roman"/>
           <w:b/>
-          <w:color w:val="1A3A5C"/>
         </w:rPr>
         <w:t xml:space="preserve"> — </w:t>
       </w:r>
       <w:r>
         <w:rPr>
           <w:rFonts w:ascii="Times New Roman" w:hAnsi="Times New Roman" w:cs="Times New Roman"/>
-          <w:color w:val="444441"/>
         </w:rPr>
         <w:t xml:space="preserve">The percentage of </w:t>
       </w:r>
@@ -3745,7 +3592,6 @@
       <w:r>
         <w:rPr>
           <w:rFonts w:ascii="Times New Roman" w:hAnsi="Times New Roman" w:cs="Times New Roman"/>
-          <w:color w:val="444441"/>
         </w:rPr>
         <w:t>TRx</w:t>
       </w:r>
@@ -3753,7 +3599,6 @@
       <w:r>
         <w:rPr>
           <w:rFonts w:ascii="Times New Roman" w:hAnsi="Times New Roman" w:cs="Times New Roman"/>
-          <w:color w:val="444441"/>
         </w:rPr>
         <w:t xml:space="preserve"> credit allocated to the assigned rep. </w:t>
       </w:r>
@@ -3765,7 +3610,6 @@
         <w:rPr>
           <w:rFonts w:ascii="Times New Roman" w:hAnsi="Times New Roman" w:cs="Times New Roman"/>
           <w:b/>
-          <w:color w:val="1A3A5C"/>
         </w:rPr>
       </w:pPr>
     </w:p>
@@ -3781,7 +3625,6 @@
         <w:rPr>
           <w:rFonts w:ascii="Times New Roman" w:hAnsi="Times New Roman" w:cs="Times New Roman"/>
           <w:b/>
-          <w:color w:val="185FA5"/>
         </w:rPr>
         <w:t>3.5 Crediting Formula and Logic</w:t>
       </w:r>
@@ -3798,7 +3641,6 @@
         <w:rPr>
           <w:rFonts w:ascii="Times New Roman" w:hAnsi="Times New Roman" w:cs="Times New Roman"/>
           <w:b/>
-          <w:color w:val="1A3A5C"/>
         </w:rPr>
         <w:t xml:space="preserve">Credited </w:t>
       </w:r>
@@ -3807,7 +3649,6 @@
         <w:rPr>
           <w:rFonts w:ascii="Times New Roman" w:hAnsi="Times New Roman" w:cs="Times New Roman"/>
           <w:b/>
-          <w:color w:val="1A3A5C"/>
         </w:rPr>
         <w:t>TRx</w:t>
       </w:r>
@@ -3816,24 +3657,14 @@
         <w:rPr>
           <w:rFonts w:ascii="Times New Roman" w:hAnsi="Times New Roman" w:cs="Times New Roman"/>
           <w:b/>
-          <w:color w:val="1A3A5C"/>
-        </w:rPr>
-        <w:t xml:space="preserve">:  </w:t>
-      </w:r>
-      <w:r>
-        <w:rPr>
-          <w:rFonts w:ascii="Times New Roman" w:hAnsi="Times New Roman" w:cs="Times New Roman"/>
-          <w:b/>
-          <w:color w:val="185FA5"/>
-        </w:rPr>
-        <w:t xml:space="preserve">Credited </w:t>
+        </w:rPr>
+        <w:t xml:space="preserve">:  Credited </w:t>
       </w:r>
       <w:proofErr w:type="spellStart"/>
       <w:r>
         <w:rPr>
           <w:rFonts w:ascii="Times New Roman" w:hAnsi="Times New Roman" w:cs="Times New Roman"/>
           <w:b/>
-          <w:color w:val="185FA5"/>
         </w:rPr>
         <w:t>TRx</w:t>
       </w:r>
@@ -3842,7 +3673,6 @@
         <w:rPr>
           <w:rFonts w:ascii="Times New Roman" w:hAnsi="Times New Roman" w:cs="Times New Roman"/>
           <w:b/>
-          <w:color w:val="185FA5"/>
         </w:rPr>
         <w:t xml:space="preserve"> = </w:t>
       </w:r>
@@ -3851,7 +3681,6 @@
         <w:rPr>
           <w:rFonts w:ascii="Times New Roman" w:hAnsi="Times New Roman" w:cs="Times New Roman"/>
           <w:b/>
-          <w:color w:val="185FA5"/>
         </w:rPr>
         <w:t>dermacline_trx</w:t>
       </w:r>
@@ -3860,7 +3689,6 @@
         <w:rPr>
           <w:rFonts w:ascii="Times New Roman" w:hAnsi="Times New Roman" w:cs="Times New Roman"/>
           <w:b/>
-          <w:color w:val="185FA5"/>
         </w:rPr>
         <w:t xml:space="preserve"> × </w:t>
       </w:r>
@@ -3869,7 +3697,6 @@
         <w:rPr>
           <w:rFonts w:ascii="Times New Roman" w:hAnsi="Times New Roman" w:cs="Times New Roman"/>
           <w:b/>
-          <w:color w:val="185FA5"/>
         </w:rPr>
         <w:t>assignment_pct</w:t>
       </w:r>
@@ -3887,15 +3714,12 @@
         <w:rPr>
           <w:rFonts w:ascii="Times New Roman" w:hAnsi="Times New Roman" w:cs="Times New Roman"/>
           <w:b/>
-          <w:color w:val="444441"/>
-        </w:rPr>
-        <w:lastRenderedPageBreak/>
+        </w:rPr>
         <w:t xml:space="preserve">Example: </w:t>
       </w:r>
       <w:r>
         <w:rPr>
           <w:rFonts w:ascii="Times New Roman" w:hAnsi="Times New Roman" w:cs="Times New Roman"/>
-          <w:color w:val="444441"/>
         </w:rPr>
         <w:t xml:space="preserve">100 </w:t>
       </w:r>
@@ -3903,7 +3727,6 @@
       <w:r>
         <w:rPr>
           <w:rFonts w:ascii="Times New Roman" w:hAnsi="Times New Roman" w:cs="Times New Roman"/>
-          <w:color w:val="444441"/>
         </w:rPr>
         <w:t>TRx</w:t>
       </w:r>
@@ -3911,7 +3734,6 @@
       <w:r>
         <w:rPr>
           <w:rFonts w:ascii="Times New Roman" w:hAnsi="Times New Roman" w:cs="Times New Roman"/>
-          <w:color w:val="444441"/>
         </w:rPr>
         <w:t xml:space="preserve"> × 50% </w:t>
       </w:r>
@@ -3919,7 +3741,6 @@
       <w:r>
         <w:rPr>
           <w:rFonts w:ascii="Times New Roman" w:hAnsi="Times New Roman" w:cs="Times New Roman"/>
-          <w:color w:val="444441"/>
         </w:rPr>
         <w:t>assignment</w:t>
       </w:r>
@@ -3927,7 +3748,6 @@
       <w:r>
         <w:rPr>
           <w:rFonts w:ascii="Times New Roman" w:hAnsi="Times New Roman" w:cs="Times New Roman"/>
-          <w:color w:val="444441"/>
         </w:rPr>
         <w:t xml:space="preserve"> = 50 Credited </w:t>
       </w:r>
@@ -3935,7 +3755,6 @@
       <w:r>
         <w:rPr>
           <w:rFonts w:ascii="Times New Roman" w:hAnsi="Times New Roman" w:cs="Times New Roman"/>
-          <w:color w:val="444441"/>
         </w:rPr>
         <w:t>TRx</w:t>
       </w:r>
@@ -3943,7 +3762,6 @@
       <w:r>
         <w:rPr>
           <w:rFonts w:ascii="Times New Roman" w:hAnsi="Times New Roman" w:cs="Times New Roman"/>
-          <w:color w:val="444441"/>
         </w:rPr>
         <w:t xml:space="preserve"> counted toward IC</w:t>
       </w:r>
@@ -3969,7 +3787,6 @@
         <w:rPr>
           <w:rFonts w:ascii="Times New Roman" w:hAnsi="Times New Roman" w:cs="Times New Roman"/>
           <w:b/>
-          <w:color w:val="1A3A5C"/>
         </w:rPr>
         <w:t>SECTION 4: SPECIALTY CODE REFERENCE</w:t>
       </w:r>
@@ -3985,7 +3802,6 @@
       <w:r>
         <w:rPr>
           <w:rFonts w:ascii="Times New Roman" w:hAnsi="Times New Roman" w:cs="Times New Roman"/>
-          <w:color w:val="444441"/>
         </w:rPr>
         <w:t xml:space="preserve">The following specialty codes are used to validate HCP </w:t>
       </w:r>
@@ -4008,14 +3824,12 @@
         <w:rPr>
           <w:rFonts w:ascii="Times New Roman" w:hAnsi="Times New Roman" w:cs="Times New Roman"/>
           <w:b/>
-          <w:color w:val="1A3A5C"/>
         </w:rPr>
         <w:t xml:space="preserve">ADU — </w:t>
       </w:r>
       <w:r>
         <w:rPr>
           <w:rFonts w:ascii="Times New Roman" w:hAnsi="Times New Roman" w:cs="Times New Roman"/>
-          <w:color w:val="444441"/>
         </w:rPr>
         <w:t>Internal Medicine</w:t>
       </w:r>
@@ -4033,14 +3847,12 @@
         <w:rPr>
           <w:rFonts w:ascii="Times New Roman" w:hAnsi="Times New Roman" w:cs="Times New Roman"/>
           <w:b/>
-          <w:color w:val="1A3A5C"/>
         </w:rPr>
         <w:t xml:space="preserve">AMI — </w:t>
       </w:r>
       <w:r>
         <w:rPr>
           <w:rFonts w:ascii="Times New Roman" w:hAnsi="Times New Roman" w:cs="Times New Roman"/>
-          <w:color w:val="444441"/>
         </w:rPr>
         <w:t>Internal Medicine</w:t>
       </w:r>
@@ -4058,14 +3870,12 @@
         <w:rPr>
           <w:rFonts w:ascii="Times New Roman" w:hAnsi="Times New Roman" w:cs="Times New Roman"/>
           <w:b/>
-          <w:color w:val="1A3A5C"/>
         </w:rPr>
         <w:t xml:space="preserve">IEC — </w:t>
       </w:r>
       <w:r>
         <w:rPr>
           <w:rFonts w:ascii="Times New Roman" w:hAnsi="Times New Roman" w:cs="Times New Roman"/>
-          <w:color w:val="444441"/>
         </w:rPr>
         <w:t>Internal Medicine</w:t>
       </w:r>
@@ -4083,14 +3893,12 @@
         <w:rPr>
           <w:rFonts w:ascii="Times New Roman" w:hAnsi="Times New Roman" w:cs="Times New Roman"/>
           <w:b/>
-          <w:color w:val="1A3A5C"/>
         </w:rPr>
         <w:t xml:space="preserve">END — </w:t>
       </w:r>
       <w:r>
         <w:rPr>
           <w:rFonts w:ascii="Times New Roman" w:hAnsi="Times New Roman" w:cs="Times New Roman"/>
-          <w:color w:val="444441"/>
         </w:rPr>
         <w:t>Internal Medicine</w:t>
       </w:r>
@@ -4108,14 +3916,12 @@
         <w:rPr>
           <w:rFonts w:ascii="Times New Roman" w:hAnsi="Times New Roman" w:cs="Times New Roman"/>
           <w:b/>
-          <w:color w:val="1A3A5C"/>
         </w:rPr>
         <w:t xml:space="preserve">IFP — </w:t>
       </w:r>
       <w:r>
         <w:rPr>
           <w:rFonts w:ascii="Times New Roman" w:hAnsi="Times New Roman" w:cs="Times New Roman"/>
-          <w:color w:val="444441"/>
         </w:rPr>
         <w:t>Internal Medicine</w:t>
       </w:r>
@@ -4133,14 +3939,12 @@
         <w:rPr>
           <w:rFonts w:ascii="Times New Roman" w:hAnsi="Times New Roman" w:cs="Times New Roman"/>
           <w:b/>
-          <w:color w:val="1A3A5C"/>
         </w:rPr>
         <w:t xml:space="preserve">IM — </w:t>
       </w:r>
       <w:r>
         <w:rPr>
           <w:rFonts w:ascii="Times New Roman" w:hAnsi="Times New Roman" w:cs="Times New Roman"/>
-          <w:color w:val="444441"/>
         </w:rPr>
         <w:t>Internal Medicine</w:t>
       </w:r>
@@ -4158,14 +3962,12 @@
         <w:rPr>
           <w:rFonts w:ascii="Times New Roman" w:hAnsi="Times New Roman" w:cs="Times New Roman"/>
           <w:b/>
-          <w:color w:val="1A3A5C"/>
         </w:rPr>
         <w:t xml:space="preserve">IPM — </w:t>
       </w:r>
       <w:r>
         <w:rPr>
           <w:rFonts w:ascii="Times New Roman" w:hAnsi="Times New Roman" w:cs="Times New Roman"/>
-          <w:color w:val="444441"/>
         </w:rPr>
         <w:t>Internal Medicine</w:t>
       </w:r>
@@ -4183,14 +3985,12 @@
         <w:rPr>
           <w:rFonts w:ascii="Times New Roman" w:hAnsi="Times New Roman" w:cs="Times New Roman"/>
           <w:b/>
-          <w:color w:val="1A3A5C"/>
         </w:rPr>
         <w:t xml:space="preserve">IMG — </w:t>
       </w:r>
       <w:r>
         <w:rPr>
           <w:rFonts w:ascii="Times New Roman" w:hAnsi="Times New Roman" w:cs="Times New Roman"/>
-          <w:color w:val="444441"/>
         </w:rPr>
         <w:t>Geriatrics (Internal Medicine sub-specialty)</w:t>
       </w:r>
@@ -4209,7 +4009,6 @@
         <w:rPr>
           <w:rFonts w:ascii="Times New Roman" w:hAnsi="Times New Roman" w:cs="Times New Roman"/>
           <w:b/>
-          <w:color w:val="1A3A5C"/>
         </w:rPr>
         <w:t>AN —</w:t>
       </w:r>
@@ -4218,14 +4017,12 @@
         <w:rPr>
           <w:rFonts w:ascii="Times New Roman" w:hAnsi="Times New Roman" w:cs="Times New Roman"/>
           <w:b/>
-          <w:color w:val="1A3A5C"/>
         </w:rPr>
         <w:t xml:space="preserve"> </w:t>
       </w:r>
       <w:r>
         <w:rPr>
           <w:rFonts w:ascii="Times New Roman" w:hAnsi="Times New Roman" w:cs="Times New Roman"/>
-          <w:color w:val="444441"/>
         </w:rPr>
         <w:t>Anesthesiology</w:t>
       </w:r>
@@ -4243,14 +4040,12 @@
         <w:rPr>
           <w:rFonts w:ascii="Times New Roman" w:hAnsi="Times New Roman" w:cs="Times New Roman"/>
           <w:b/>
-          <w:color w:val="1A3A5C"/>
         </w:rPr>
         <w:t xml:space="preserve">APM — </w:t>
       </w:r>
       <w:r>
         <w:rPr>
           <w:rFonts w:ascii="Times New Roman" w:hAnsi="Times New Roman" w:cs="Times New Roman"/>
-          <w:color w:val="444441"/>
         </w:rPr>
         <w:t>Anesthesiology</w:t>
       </w:r>
@@ -4268,14 +4063,12 @@
         <w:rPr>
           <w:rFonts w:ascii="Times New Roman" w:hAnsi="Times New Roman" w:cs="Times New Roman"/>
           <w:b/>
-          <w:color w:val="1A3A5C"/>
         </w:rPr>
         <w:t xml:space="preserve">FH — </w:t>
       </w:r>
       <w:r>
         <w:rPr>
           <w:rFonts w:ascii="Times New Roman" w:hAnsi="Times New Roman" w:cs="Times New Roman"/>
-          <w:color w:val="444441"/>
         </w:rPr>
         <w:t>Family Medicine / General Practice</w:t>
       </w:r>
@@ -4293,14 +4086,12 @@
         <w:rPr>
           <w:rFonts w:ascii="Times New Roman" w:hAnsi="Times New Roman" w:cs="Times New Roman"/>
           <w:b/>
-          <w:color w:val="1A3A5C"/>
         </w:rPr>
         <w:t xml:space="preserve">FM — </w:t>
       </w:r>
       <w:r>
         <w:rPr>
           <w:rFonts w:ascii="Times New Roman" w:hAnsi="Times New Roman" w:cs="Times New Roman"/>
-          <w:color w:val="444441"/>
         </w:rPr>
         <w:t>Family Medicine / General Practice</w:t>
       </w:r>
@@ -4318,14 +4109,12 @@
         <w:rPr>
           <w:rFonts w:ascii="Times New Roman" w:hAnsi="Times New Roman" w:cs="Times New Roman"/>
           <w:b/>
-          <w:color w:val="1A3A5C"/>
         </w:rPr>
         <w:t xml:space="preserve">FP — </w:t>
       </w:r>
       <w:r>
         <w:rPr>
           <w:rFonts w:ascii="Times New Roman" w:hAnsi="Times New Roman" w:cs="Times New Roman"/>
-          <w:color w:val="444441"/>
         </w:rPr>
         <w:t>Family Medicine / General Practice</w:t>
       </w:r>
@@ -4343,14 +4132,12 @@
         <w:rPr>
           <w:rFonts w:ascii="Times New Roman" w:hAnsi="Times New Roman" w:cs="Times New Roman"/>
           <w:b/>
-          <w:color w:val="1A3A5C"/>
         </w:rPr>
         <w:t xml:space="preserve">GP — </w:t>
       </w:r>
       <w:r>
         <w:rPr>
           <w:rFonts w:ascii="Times New Roman" w:hAnsi="Times New Roman" w:cs="Times New Roman"/>
-          <w:color w:val="444441"/>
         </w:rPr>
         <w:t>Family Medicine / General Practice</w:t>
       </w:r>
@@ -4368,14 +4155,12 @@
         <w:rPr>
           <w:rFonts w:ascii="Times New Roman" w:hAnsi="Times New Roman" w:cs="Times New Roman"/>
           <w:b/>
-          <w:color w:val="1A3A5C"/>
         </w:rPr>
         <w:t xml:space="preserve">AC — </w:t>
       </w:r>
       <w:r>
         <w:rPr>
           <w:rFonts w:ascii="Times New Roman" w:hAnsi="Times New Roman" w:cs="Times New Roman"/>
-          <w:color w:val="444441"/>
         </w:rPr>
         <w:t>Family Medicine / General Practice</w:t>
       </w:r>
@@ -4393,14 +4178,12 @@
         <w:rPr>
           <w:rFonts w:ascii="Times New Roman" w:hAnsi="Times New Roman" w:cs="Times New Roman"/>
           <w:b/>
-          <w:color w:val="1A3A5C"/>
         </w:rPr>
         <w:t xml:space="preserve">AMF — </w:t>
       </w:r>
       <w:r>
         <w:rPr>
           <w:rFonts w:ascii="Times New Roman" w:hAnsi="Times New Roman" w:cs="Times New Roman"/>
-          <w:color w:val="444441"/>
         </w:rPr>
         <w:t>Family Medicine / General Practice</w:t>
       </w:r>
@@ -4418,14 +4201,12 @@
         <w:rPr>
           <w:rFonts w:ascii="Times New Roman" w:hAnsi="Times New Roman" w:cs="Times New Roman"/>
           <w:b/>
-          <w:color w:val="1A3A5C"/>
         </w:rPr>
         <w:t xml:space="preserve">PRCP — </w:t>
       </w:r>
       <w:r>
         <w:rPr>
           <w:rFonts w:ascii="Times New Roman" w:hAnsi="Times New Roman" w:cs="Times New Roman"/>
-          <w:color w:val="444441"/>
         </w:rPr>
         <w:t>Family Medicine / General Practice</w:t>
       </w:r>
@@ -4443,14 +4224,12 @@
         <w:rPr>
           <w:rFonts w:ascii="Times New Roman" w:hAnsi="Times New Roman" w:cs="Times New Roman"/>
           <w:b/>
-          <w:color w:val="1A3A5C"/>
         </w:rPr>
         <w:t xml:space="preserve">RCH — </w:t>
       </w:r>
       <w:r>
         <w:rPr>
           <w:rFonts w:ascii="Times New Roman" w:hAnsi="Times New Roman" w:cs="Times New Roman"/>
-          <w:color w:val="444441"/>
         </w:rPr>
         <w:t>Family Medicine / General Practice</w:t>
       </w:r>
@@ -4468,14 +4247,12 @@
         <w:rPr>
           <w:rFonts w:ascii="Times New Roman" w:hAnsi="Times New Roman" w:cs="Times New Roman"/>
           <w:b/>
-          <w:color w:val="1A3A5C"/>
         </w:rPr>
         <w:t xml:space="preserve">SCH — </w:t>
       </w:r>
       <w:r>
         <w:rPr>
           <w:rFonts w:ascii="Times New Roman" w:hAnsi="Times New Roman" w:cs="Times New Roman"/>
-          <w:color w:val="444441"/>
         </w:rPr>
         <w:t>Family Medicine / General Practice</w:t>
       </w:r>
@@ -4493,14 +4270,13 @@
         <w:rPr>
           <w:rFonts w:ascii="Times New Roman" w:hAnsi="Times New Roman" w:cs="Times New Roman"/>
           <w:b/>
-          <w:color w:val="1A3A5C"/>
-        </w:rPr>
+        </w:rPr>
+        <w:lastRenderedPageBreak/>
         <w:t xml:space="preserve">FPG — </w:t>
       </w:r>
       <w:r>
         <w:rPr>
           <w:rFonts w:ascii="Times New Roman" w:hAnsi="Times New Roman" w:cs="Times New Roman"/>
-          <w:color w:val="444441"/>
         </w:rPr>
         <w:t>Geriatrics (Family Medicine sub-specialty)</w:t>
       </w:r>
@@ -4518,14 +4294,12 @@
         <w:rPr>
           <w:rFonts w:ascii="Times New Roman" w:hAnsi="Times New Roman" w:cs="Times New Roman"/>
           <w:b/>
-          <w:color w:val="1A3A5C"/>
         </w:rPr>
         <w:t xml:space="preserve">MEM — </w:t>
       </w:r>
       <w:r>
         <w:rPr>
           <w:rFonts w:ascii="Times New Roman" w:hAnsi="Times New Roman" w:cs="Times New Roman"/>
-          <w:color w:val="444441"/>
         </w:rPr>
         <w:t>Emergency Medicine</w:t>
       </w:r>
@@ -4543,14 +4317,12 @@
         <w:rPr>
           <w:rFonts w:ascii="Times New Roman" w:hAnsi="Times New Roman" w:cs="Times New Roman"/>
           <w:b/>
-          <w:color w:val="1A3A5C"/>
         </w:rPr>
         <w:t xml:space="preserve">EM — </w:t>
       </w:r>
       <w:r>
         <w:rPr>
           <w:rFonts w:ascii="Times New Roman" w:hAnsi="Times New Roman" w:cs="Times New Roman"/>
-          <w:color w:val="444441"/>
         </w:rPr>
         <w:t>Emergency Medicine</w:t>
       </w:r>
@@ -4568,14 +4340,12 @@
         <w:rPr>
           <w:rFonts w:ascii="Times New Roman" w:hAnsi="Times New Roman" w:cs="Times New Roman"/>
           <w:b/>
-          <w:color w:val="1A3A5C"/>
         </w:rPr>
         <w:t xml:space="preserve">EMS — </w:t>
       </w:r>
       <w:r>
         <w:rPr>
           <w:rFonts w:ascii="Times New Roman" w:hAnsi="Times New Roman" w:cs="Times New Roman"/>
-          <w:color w:val="444441"/>
         </w:rPr>
         <w:t>Emergency Medicine</w:t>
       </w:r>
@@ -4593,14 +4363,12 @@
         <w:rPr>
           <w:rFonts w:ascii="Times New Roman" w:hAnsi="Times New Roman" w:cs="Times New Roman"/>
           <w:b/>
-          <w:color w:val="1A3A5C"/>
         </w:rPr>
         <w:t xml:space="preserve">UCM — </w:t>
       </w:r>
       <w:r>
         <w:rPr>
           <w:rFonts w:ascii="Times New Roman" w:hAnsi="Times New Roman" w:cs="Times New Roman"/>
-          <w:color w:val="444441"/>
         </w:rPr>
         <w:t>Emergency Medicine</w:t>
       </w:r>
@@ -4618,14 +4386,12 @@
         <w:rPr>
           <w:rFonts w:ascii="Times New Roman" w:hAnsi="Times New Roman" w:cs="Times New Roman"/>
           <w:b/>
-          <w:color w:val="1A3A5C"/>
         </w:rPr>
         <w:t xml:space="preserve">N — </w:t>
       </w:r>
       <w:r>
         <w:rPr>
           <w:rFonts w:ascii="Times New Roman" w:hAnsi="Times New Roman" w:cs="Times New Roman"/>
-          <w:color w:val="444441"/>
         </w:rPr>
         <w:t>Neurology</w:t>
       </w:r>
@@ -4643,14 +4409,12 @@
         <w:rPr>
           <w:rFonts w:ascii="Times New Roman" w:hAnsi="Times New Roman" w:cs="Times New Roman"/>
           <w:b/>
-          <w:color w:val="1A3A5C"/>
         </w:rPr>
         <w:t xml:space="preserve">NMN — </w:t>
       </w:r>
       <w:r>
         <w:rPr>
           <w:rFonts w:ascii="Times New Roman" w:hAnsi="Times New Roman" w:cs="Times New Roman"/>
-          <w:color w:val="444441"/>
         </w:rPr>
         <w:t>Neurology</w:t>
       </w:r>
@@ -4668,14 +4432,12 @@
         <w:rPr>
           <w:rFonts w:ascii="Times New Roman" w:hAnsi="Times New Roman" w:cs="Times New Roman"/>
           <w:b/>
-          <w:color w:val="1A3A5C"/>
         </w:rPr>
         <w:t xml:space="preserve">NMP — </w:t>
       </w:r>
       <w:r>
         <w:rPr>
           <w:rFonts w:ascii="Times New Roman" w:hAnsi="Times New Roman" w:cs="Times New Roman"/>
-          <w:color w:val="444441"/>
         </w:rPr>
         <w:t>Neurology</w:t>
       </w:r>
@@ -4693,14 +4455,12 @@
         <w:rPr>
           <w:rFonts w:ascii="Times New Roman" w:hAnsi="Times New Roman" w:cs="Times New Roman"/>
           <w:b/>
-          <w:color w:val="1A3A5C"/>
         </w:rPr>
         <w:t xml:space="preserve">NPR — </w:t>
       </w:r>
       <w:r>
         <w:rPr>
           <w:rFonts w:ascii="Times New Roman" w:hAnsi="Times New Roman" w:cs="Times New Roman"/>
-          <w:color w:val="444441"/>
         </w:rPr>
         <w:t>Neurology</w:t>
       </w:r>
@@ -4718,14 +4478,12 @@
         <w:rPr>
           <w:rFonts w:ascii="Times New Roman" w:hAnsi="Times New Roman" w:cs="Times New Roman"/>
           <w:b/>
-          <w:color w:val="1A3A5C"/>
         </w:rPr>
         <w:t xml:space="preserve">PMN — </w:t>
       </w:r>
       <w:r>
         <w:rPr>
           <w:rFonts w:ascii="Times New Roman" w:hAnsi="Times New Roman" w:cs="Times New Roman"/>
-          <w:color w:val="444441"/>
         </w:rPr>
         <w:t>Neurology</w:t>
       </w:r>
@@ -4743,14 +4501,12 @@
         <w:rPr>
           <w:rFonts w:ascii="Times New Roman" w:hAnsi="Times New Roman" w:cs="Times New Roman"/>
           <w:b/>
-          <w:color w:val="1A3A5C"/>
         </w:rPr>
         <w:t xml:space="preserve">VN — </w:t>
       </w:r>
       <w:r>
         <w:rPr>
           <w:rFonts w:ascii="Times New Roman" w:hAnsi="Times New Roman" w:cs="Times New Roman"/>
-          <w:color w:val="444441"/>
         </w:rPr>
         <w:t>Neurology</w:t>
       </w:r>
@@ -4768,14 +4524,12 @@
         <w:rPr>
           <w:rFonts w:ascii="Times New Roman" w:hAnsi="Times New Roman" w:cs="Times New Roman"/>
           <w:b/>
-          <w:color w:val="1A3A5C"/>
         </w:rPr>
         <w:t xml:space="preserve">PM — </w:t>
       </w:r>
       <w:r>
         <w:rPr>
           <w:rFonts w:ascii="Times New Roman" w:hAnsi="Times New Roman" w:cs="Times New Roman"/>
-          <w:color w:val="444441"/>
         </w:rPr>
         <w:t>Physical Medicine and Rehabilitation</w:t>
       </w:r>
@@ -4793,14 +4547,12 @@
         <w:rPr>
           <w:rFonts w:ascii="Times New Roman" w:hAnsi="Times New Roman" w:cs="Times New Roman"/>
           <w:b/>
-          <w:color w:val="1A3A5C"/>
         </w:rPr>
         <w:t xml:space="preserve">PMP — </w:t>
       </w:r>
       <w:r>
         <w:rPr>
           <w:rFonts w:ascii="Times New Roman" w:hAnsi="Times New Roman" w:cs="Times New Roman"/>
-          <w:color w:val="444441"/>
         </w:rPr>
         <w:t>Physical Medicine and Rehabilitation</w:t>
       </w:r>
@@ -4818,14 +4570,12 @@
         <w:rPr>
           <w:rFonts w:ascii="Times New Roman" w:hAnsi="Times New Roman" w:cs="Times New Roman"/>
           <w:b/>
-          <w:color w:val="1A3A5C"/>
         </w:rPr>
         <w:t xml:space="preserve">PMR — </w:t>
       </w:r>
       <w:r>
         <w:rPr>
           <w:rFonts w:ascii="Times New Roman" w:hAnsi="Times New Roman" w:cs="Times New Roman"/>
-          <w:color w:val="444441"/>
         </w:rPr>
         <w:t>Physical Medicine and Rehabilitation</w:t>
       </w:r>
@@ -4843,14 +4593,12 @@
         <w:rPr>
           <w:rFonts w:ascii="Times New Roman" w:hAnsi="Times New Roman" w:cs="Times New Roman"/>
           <w:b/>
-          <w:color w:val="1A3A5C"/>
         </w:rPr>
         <w:t xml:space="preserve">PRS — </w:t>
       </w:r>
       <w:r>
         <w:rPr>
           <w:rFonts w:ascii="Times New Roman" w:hAnsi="Times New Roman" w:cs="Times New Roman"/>
-          <w:color w:val="444441"/>
         </w:rPr>
         <w:t>Physical Medicine and Rehabilitation</w:t>
       </w:r>
@@ -4868,14 +4616,12 @@
         <w:rPr>
           <w:rFonts w:ascii="Times New Roman" w:hAnsi="Times New Roman" w:cs="Times New Roman"/>
           <w:b/>
-          <w:color w:val="1A3A5C"/>
         </w:rPr>
         <w:t xml:space="preserve">PMD — </w:t>
       </w:r>
       <w:r>
         <w:rPr>
           <w:rFonts w:ascii="Times New Roman" w:hAnsi="Times New Roman" w:cs="Times New Roman"/>
-          <w:color w:val="444441"/>
         </w:rPr>
         <w:t>Pain Medicine</w:t>
       </w:r>
@@ -4893,14 +4639,12 @@
         <w:rPr>
           <w:rFonts w:ascii="Times New Roman" w:hAnsi="Times New Roman" w:cs="Times New Roman"/>
           <w:b/>
-          <w:color w:val="1A3A5C"/>
         </w:rPr>
         <w:t xml:space="preserve">RHU — </w:t>
       </w:r>
       <w:r>
         <w:rPr>
           <w:rFonts w:ascii="Times New Roman" w:hAnsi="Times New Roman" w:cs="Times New Roman"/>
-          <w:color w:val="444441"/>
         </w:rPr>
         <w:t>Rheumatology</w:t>
       </w:r>
@@ -4918,14 +4662,12 @@
         <w:rPr>
           <w:rFonts w:ascii="Times New Roman" w:hAnsi="Times New Roman" w:cs="Times New Roman"/>
           <w:b/>
-          <w:color w:val="1A3A5C"/>
         </w:rPr>
         <w:t xml:space="preserve">HOS — </w:t>
       </w:r>
       <w:r>
         <w:rPr>
           <w:rFonts w:ascii="Times New Roman" w:hAnsi="Times New Roman" w:cs="Times New Roman"/>
-          <w:color w:val="444441"/>
         </w:rPr>
         <w:t>Hospitalist</w:t>
       </w:r>
@@ -4943,14 +4685,12 @@
         <w:rPr>
           <w:rFonts w:ascii="Times New Roman" w:hAnsi="Times New Roman" w:cs="Times New Roman"/>
           <w:b/>
-          <w:color w:val="1A3A5C"/>
         </w:rPr>
         <w:t xml:space="preserve">HPA — </w:t>
       </w:r>
       <w:r>
         <w:rPr>
           <w:rFonts w:ascii="Times New Roman" w:hAnsi="Times New Roman" w:cs="Times New Roman"/>
-          <w:color w:val="444441"/>
         </w:rPr>
         <w:t>Hospice and Palliative Medicine — Anesthesiology background</w:t>
       </w:r>
@@ -4968,14 +4708,12 @@
         <w:rPr>
           <w:rFonts w:ascii="Times New Roman" w:hAnsi="Times New Roman" w:cs="Times New Roman"/>
           <w:b/>
-          <w:color w:val="1A3A5C"/>
         </w:rPr>
         <w:t xml:space="preserve">HPF — </w:t>
       </w:r>
       <w:r>
         <w:rPr>
           <w:rFonts w:ascii="Times New Roman" w:hAnsi="Times New Roman" w:cs="Times New Roman"/>
-          <w:color w:val="444441"/>
         </w:rPr>
         <w:t>Hospice and Palliative Medicine — Family Medicine background</w:t>
       </w:r>
@@ -4993,14 +4731,12 @@
         <w:rPr>
           <w:rFonts w:ascii="Times New Roman" w:hAnsi="Times New Roman" w:cs="Times New Roman"/>
           <w:b/>
-          <w:color w:val="1A3A5C"/>
         </w:rPr>
         <w:t xml:space="preserve">HPI — </w:t>
       </w:r>
       <w:r>
         <w:rPr>
           <w:rFonts w:ascii="Times New Roman" w:hAnsi="Times New Roman" w:cs="Times New Roman"/>
-          <w:color w:val="444441"/>
         </w:rPr>
         <w:t>Hospice and Palliative Medicine — Internal Medicine background</w:t>
       </w:r>
@@ -5018,15 +4754,12 @@
         <w:rPr>
           <w:rFonts w:ascii="Times New Roman" w:hAnsi="Times New Roman" w:cs="Times New Roman"/>
           <w:b/>
-          <w:color w:val="1A3A5C"/>
-        </w:rPr>
-        <w:lastRenderedPageBreak/>
+        </w:rPr>
         <w:t xml:space="preserve">HPM — </w:t>
       </w:r>
       <w:r>
         <w:rPr>
           <w:rFonts w:ascii="Times New Roman" w:hAnsi="Times New Roman" w:cs="Times New Roman"/>
-          <w:color w:val="444441"/>
         </w:rPr>
         <w:t>Hospice and Palliative Medicine — General</w:t>
       </w:r>

</xml_diff>